<commit_message>
Update competitive analysis and remove competitor brand names
Replace specific competitor brand names with category-based competitive analysis matrices across master pitch, investor summary, and investor presentation documents. Update script logic to dynamically generate these updated documents.

Replit-Commit-Author: Agent
Replit-Commit-Session-Id: 023a983f-7666-4005-8f1f-15e7e2294c87
Replit-Commit-Checkpoint-Type: full_checkpoint
Replit-Commit-Event-Id: a2ed8b5d-95de-4ab2-81bb-1b585f57d7ad
Replit-Commit-Screenshot-Url: https://storage.googleapis.com/screenshot-production-us-central1/066e05bb-42f5-4743-94c7-df5af828948c/023a983f-7666-4005-8f1f-15e7e2294c87/Js72qLZ
Replit-Helium-Checkpoint-Created: true
</commit_message>
<xml_diff>
--- a/outputs/Ticarium365-Master-Pitch.docx
+++ b/outputs/Ticarium365-Master-Pitch.docx
@@ -236,7 +236,7 @@
           <w:sz w:val="22"/>
           <w:szCs w:val="22"/>
         </w:rPr>
-        <w:t xml:space="preserve">Pazardaki temel boşluk: KOBİ sahibi bugün ön muhasebe (Paraşüt/Bizim Hesap), pazaryeri panelleri, fiziksel POS yazılımı, e-fatura entegratörü ve gider takibini ayrı ayrı kullanıyor. Bu modüller arasında veri kopuk, gerçek kâr (komisyon, kargo, iade dahil) hiçbir araçta net görünmüyor.</w:t>
+        <w:t xml:space="preserve">Pazardaki temel boşluk: KOBİ sahibi bugün ön muhasebe çözümleri, pazaryeri yönetim araçları, fiziksel POS yazılımları, e-fatura entegratörleri ve gider takip uygulamalarını ayrı ayrı kullanıyor. Bu modüller arasında veri kopuk, gerçek kâr (komisyon, kargo, iade dahil) hiçbir araçta net görünmüyor.</w:t>
       </w:r>
     </w:p>
     <w:p>
@@ -490,7 +490,7 @@
           <w:sz w:val="22"/>
           <w:szCs w:val="22"/>
         </w:rPr>
-        <w:t xml:space="preserve">Ön muhasebe → Paraşüt / Bizim Hesap / Logo / Mikro</w:t>
+        <w:t xml:space="preserve">Ön muhasebe → bulut tabanlı ön muhasebe çözümleri</w:t>
       </w:r>
     </w:p>
     <w:p>
@@ -508,7 +508,7 @@
           <w:sz w:val="22"/>
           <w:szCs w:val="22"/>
         </w:rPr>
-        <w:t xml:space="preserve">Stok → Excel veya yerel POS yazılımı</w:t>
+        <w:t xml:space="preserve">Stok → tablo (spreadsheet) veya yerel POS yazılımı</w:t>
       </w:r>
     </w:p>
     <w:p>
@@ -526,7 +526,7 @@
           <w:sz w:val="22"/>
           <w:szCs w:val="22"/>
         </w:rPr>
-        <w:t xml:space="preserve">Pazaryeri → Trendyol/Hepsiburada/N11 ayrı panelleri</w:t>
+        <w:t xml:space="preserve">Pazaryeri → her pazaryerinin kendi seller paneli</w:t>
       </w:r>
     </w:p>
     <w:p>
@@ -544,7 +544,7 @@
           <w:sz w:val="22"/>
           <w:szCs w:val="22"/>
         </w:rPr>
-        <w:t xml:space="preserve">E-fatura → Üçüncü parti entegratörler</w:t>
+        <w:t xml:space="preserve">E-fatura → üçüncü parti entegratör servisleri</w:t>
       </w:r>
     </w:p>
     <w:p>
@@ -562,7 +562,7 @@
           <w:sz w:val="22"/>
           <w:szCs w:val="22"/>
         </w:rPr>
-        <w:t xml:space="preserve">CRM/cari hesap → kâğıt veya WhatsApp</w:t>
+        <w:t xml:space="preserve">CRM / cari hesap → kâğıt defter veya mesajlaşma uygulaması</w:t>
       </w:r>
     </w:p>
     <w:p>
@@ -1753,7 +1753,7 @@
                 <w:sz w:val="20"/>
                 <w:szCs w:val="20"/>
               </w:rPr>
-              <w:t xml:space="preserve">Pazaryeri (Trendyol/Hepsi/N11)</w:t>
+              <w:t xml:space="preserve">Pazaryeri Sync (büyük yerel pazaryerleri)</w:t>
             </w:r>
           </w:p>
         </w:tc>
@@ -2774,7 +2774,7 @@
                 <w:sz w:val="20"/>
                 <w:szCs w:val="20"/>
               </w:rPr>
-              <w:t xml:space="preserve">Trendyol/Hepsi API key/seller hesabı</w:t>
+              <w:t xml:space="preserve">Yerel pazaryeri API key + seller hesabı</w:t>
             </w:r>
           </w:p>
         </w:tc>
@@ -3509,7 +3509,7 @@
           <w:sz w:val="22"/>
           <w:szCs w:val="22"/>
         </w:rPr>
-        <w:t xml:space="preserve">E-fatura entegratör (Logo, GİB)</w:t>
+        <w:t xml:space="preserve">E-fatura entegratör (GİB onaylı entegratör seçimi)</w:t>
       </w:r>
     </w:p>
     <w:p>
@@ -3527,7 +3527,7 @@
           <w:sz w:val="22"/>
           <w:szCs w:val="22"/>
         </w:rPr>
-        <w:t xml:space="preserve">Logo / Mikro / Paraşüt veri içe aktarım sihirbazı</w:t>
+        <w:t xml:space="preserve">Geleneksel ön muhasebe ve ERP sistemlerinden veri içe aktarım sihirbazı</w:t>
       </w:r>
     </w:p>
     <w:p>
@@ -9131,7 +9131,21 @@
           <w:sz w:val="36"/>
           <w:szCs w:val="36"/>
         </w:rPr>
-        <w:t xml:space="preserve">11. SWOT Analizi</w:t>
+        <w:t xml:space="preserve">11. Kategori Bazlı Rekabet Analizi</w:t>
+      </w:r>
+    </w:p>
+    <w:p>
+      <w:pPr>
+        <w:spacing w:after="120" w:line="300"/>
+        <w:jc w:val="left"/>
+      </w:pPr>
+      <w:r>
+        <w:rPr>
+          <w:rFonts w:ascii="Calibri" w:cs="Calibri" w:eastAsia="Calibri" w:hAnsi="Calibri"/>
+          <w:sz w:val="22"/>
+          <w:szCs w:val="22"/>
+        </w:rPr>
+        <w:t xml:space="preserve">Pazarda Ticarium365'in birebir muadili tek bir ürün bulunmamaktadır. Rekabet beş ayrı yazılım kategorisinden gelen kısmi çözümlerle yaşanmaktadır. Aşağıdaki matris bu kategorileri kapsam, hedef segment ve eksik kalan ihtiyaçlar açısından karşılaştırır.</w:t>
       </w:r>
     </w:p>
     <w:p>
@@ -9148,7 +9162,3069 @@
           <w:sz w:val="24"/>
           <w:szCs w:val="24"/>
         </w:rPr>
-        <w:t xml:space="preserve">Güçlü Yönler (Strengths)</w:t>
+        <w:t xml:space="preserve">Ana Karşılaştırma Matrisi</w:t>
+      </w:r>
+    </w:p>
+    <w:tbl>
+      <w:tblPr>
+        <w:tblW w:type="pct" w:w="100%"/>
+        <w:tblBorders>
+          <w:top w:val="single" w:color="CBD5E1" w:sz="4"/>
+          <w:left w:val="single" w:color="CBD5E1" w:sz="4"/>
+          <w:bottom w:val="single" w:color="CBD5E1" w:sz="4"/>
+          <w:right w:val="single" w:color="CBD5E1" w:sz="4"/>
+          <w:insideH w:val="single" w:color="CBD5E1" w:sz="4"/>
+          <w:insideV w:val="single" w:color="CBD5E1" w:sz="4"/>
+        </w:tblBorders>
+      </w:tblPr>
+      <w:tblGrid>
+        <w:gridCol w:w="100"/>
+        <w:gridCol w:w="100"/>
+        <w:gridCol w:w="100"/>
+        <w:gridCol w:w="100"/>
+        <w:gridCol w:w="100"/>
+        <w:gridCol w:w="100"/>
+        <w:gridCol w:w="100"/>
+      </w:tblGrid>
+      <w:tr>
+        <w:trPr>
+          <w:tblHeader/>
+        </w:trPr>
+        <w:tc>
+          <w:tcPr>
+            <w:shd w:fill="F1F5F9" w:color="auto" w:val="clear"/>
+            <w:tcMar>
+              <w:top w:type="dxa" w:w="80"/>
+              <w:left w:type="dxa" w:w="120"/>
+              <w:bottom w:type="dxa" w:w="80"/>
+              <w:right w:type="dxa" w:w="120"/>
+            </w:tcMar>
+          </w:tcPr>
+          <w:p>
+            <w:pPr>
+              <w:jc w:val="center"/>
+            </w:pPr>
+            <w:r>
+              <w:rPr>
+                <w:rFonts w:ascii="Calibri" w:cs="Calibri" w:eastAsia="Calibri" w:hAnsi="Calibri"/>
+                <w:b/>
+                <w:bCs/>
+                <w:sz w:val="20"/>
+                <w:szCs w:val="20"/>
+              </w:rPr>
+              <w:t xml:space="preserve">Boyut</w:t>
+            </w:r>
+          </w:p>
+        </w:tc>
+        <w:tc>
+          <w:tcPr>
+            <w:shd w:fill="F1F5F9" w:color="auto" w:val="clear"/>
+            <w:tcMar>
+              <w:top w:type="dxa" w:w="80"/>
+              <w:left w:type="dxa" w:w="120"/>
+              <w:bottom w:type="dxa" w:w="80"/>
+              <w:right w:type="dxa" w:w="120"/>
+            </w:tcMar>
+          </w:tcPr>
+          <w:p>
+            <w:pPr>
+              <w:jc w:val="center"/>
+            </w:pPr>
+            <w:r>
+              <w:rPr>
+                <w:rFonts w:ascii="Calibri" w:cs="Calibri" w:eastAsia="Calibri" w:hAnsi="Calibri"/>
+                <w:b/>
+                <w:bCs/>
+                <w:sz w:val="20"/>
+                <w:szCs w:val="20"/>
+              </w:rPr>
+              <w:t xml:space="preserve">Ön Muhasebe SaaS</w:t>
+            </w:r>
+          </w:p>
+        </w:tc>
+        <w:tc>
+          <w:tcPr>
+            <w:shd w:fill="F1F5F9" w:color="auto" w:val="clear"/>
+            <w:tcMar>
+              <w:top w:type="dxa" w:w="80"/>
+              <w:left w:type="dxa" w:w="120"/>
+              <w:bottom w:type="dxa" w:w="80"/>
+              <w:right w:type="dxa" w:w="120"/>
+            </w:tcMar>
+          </w:tcPr>
+          <w:p>
+            <w:pPr>
+              <w:jc w:val="center"/>
+            </w:pPr>
+            <w:r>
+              <w:rPr>
+                <w:rFonts w:ascii="Calibri" w:cs="Calibri" w:eastAsia="Calibri" w:hAnsi="Calibri"/>
+                <w:b/>
+                <w:bCs/>
+                <w:sz w:val="20"/>
+                <w:szCs w:val="20"/>
+              </w:rPr>
+              <w:t xml:space="preserve">Geleneksel ERP</w:t>
+            </w:r>
+          </w:p>
+        </w:tc>
+        <w:tc>
+          <w:tcPr>
+            <w:shd w:fill="F1F5F9" w:color="auto" w:val="clear"/>
+            <w:tcMar>
+              <w:top w:type="dxa" w:w="80"/>
+              <w:left w:type="dxa" w:w="120"/>
+              <w:bottom w:type="dxa" w:w="80"/>
+              <w:right w:type="dxa" w:w="120"/>
+            </w:tcMar>
+          </w:tcPr>
+          <w:p>
+            <w:pPr>
+              <w:jc w:val="center"/>
+            </w:pPr>
+            <w:r>
+              <w:rPr>
+                <w:rFonts w:ascii="Calibri" w:cs="Calibri" w:eastAsia="Calibri" w:hAnsi="Calibri"/>
+                <w:b/>
+                <w:bCs/>
+                <w:sz w:val="20"/>
+                <w:szCs w:val="20"/>
+              </w:rPr>
+              <w:t xml:space="preserve">Pazaryeri Yönetim Aracı</w:t>
+            </w:r>
+          </w:p>
+        </w:tc>
+        <w:tc>
+          <w:tcPr>
+            <w:shd w:fill="F1F5F9" w:color="auto" w:val="clear"/>
+            <w:tcMar>
+              <w:top w:type="dxa" w:w="80"/>
+              <w:left w:type="dxa" w:w="120"/>
+              <w:bottom w:type="dxa" w:w="80"/>
+              <w:right w:type="dxa" w:w="120"/>
+            </w:tcMar>
+          </w:tcPr>
+          <w:p>
+            <w:pPr>
+              <w:jc w:val="center"/>
+            </w:pPr>
+            <w:r>
+              <w:rPr>
+                <w:rFonts w:ascii="Calibri" w:cs="Calibri" w:eastAsia="Calibri" w:hAnsi="Calibri"/>
+                <w:b/>
+                <w:bCs/>
+                <w:sz w:val="20"/>
+                <w:szCs w:val="20"/>
+              </w:rPr>
+              <w:t xml:space="preserve">POS Yazılımı</w:t>
+            </w:r>
+          </w:p>
+        </w:tc>
+        <w:tc>
+          <w:tcPr>
+            <w:shd w:fill="F1F5F9" w:color="auto" w:val="clear"/>
+            <w:tcMar>
+              <w:top w:type="dxa" w:w="80"/>
+              <w:left w:type="dxa" w:w="120"/>
+              <w:bottom w:type="dxa" w:w="80"/>
+              <w:right w:type="dxa" w:w="120"/>
+            </w:tcMar>
+          </w:tcPr>
+          <w:p>
+            <w:pPr>
+              <w:jc w:val="center"/>
+            </w:pPr>
+            <w:r>
+              <w:rPr>
+                <w:rFonts w:ascii="Calibri" w:cs="Calibri" w:eastAsia="Calibri" w:hAnsi="Calibri"/>
+                <w:b/>
+                <w:bCs/>
+                <w:sz w:val="20"/>
+                <w:szCs w:val="20"/>
+              </w:rPr>
+              <w:t xml:space="preserve">Tek Fonksiyonlu SaaS</w:t>
+            </w:r>
+          </w:p>
+        </w:tc>
+        <w:tc>
+          <w:tcPr>
+            <w:shd w:fill="F1F5F9" w:color="auto" w:val="clear"/>
+            <w:tcMar>
+              <w:top w:type="dxa" w:w="80"/>
+              <w:left w:type="dxa" w:w="120"/>
+              <w:bottom w:type="dxa" w:w="80"/>
+              <w:right w:type="dxa" w:w="120"/>
+            </w:tcMar>
+          </w:tcPr>
+          <w:p>
+            <w:pPr>
+              <w:jc w:val="center"/>
+            </w:pPr>
+            <w:r>
+              <w:rPr>
+                <w:rFonts w:ascii="Calibri" w:cs="Calibri" w:eastAsia="Calibri" w:hAnsi="Calibri"/>
+                <w:b/>
+                <w:bCs/>
+                <w:sz w:val="20"/>
+                <w:szCs w:val="20"/>
+              </w:rPr>
+              <w:t xml:space="preserve">Ticarium365</w:t>
+            </w:r>
+          </w:p>
+        </w:tc>
+      </w:tr>
+      <w:tr>
+        <w:tc>
+          <w:tcPr>
+            <w:tcMar>
+              <w:top w:type="dxa" w:w="80"/>
+              <w:left w:type="dxa" w:w="120"/>
+              <w:bottom w:type="dxa" w:w="80"/>
+              <w:right w:type="dxa" w:w="120"/>
+            </w:tcMar>
+          </w:tcPr>
+          <w:p>
+            <w:pPr>
+              <w:jc w:val="left"/>
+            </w:pPr>
+            <w:r>
+              <w:rPr>
+                <w:rFonts w:ascii="Calibri" w:cs="Calibri" w:eastAsia="Calibri" w:hAnsi="Calibri"/>
+                <w:b/>
+                <w:bCs/>
+                <w:sz w:val="20"/>
+                <w:szCs w:val="20"/>
+              </w:rPr>
+              <w:t xml:space="preserve">Hedef segment</w:t>
+            </w:r>
+          </w:p>
+        </w:tc>
+        <w:tc>
+          <w:tcPr>
+            <w:tcMar>
+              <w:top w:type="dxa" w:w="80"/>
+              <w:left w:type="dxa" w:w="120"/>
+              <w:bottom w:type="dxa" w:w="80"/>
+              <w:right w:type="dxa" w:w="120"/>
+            </w:tcMar>
+          </w:tcPr>
+          <w:p>
+            <w:pPr>
+              <w:jc w:val="right"/>
+            </w:pPr>
+            <w:r>
+              <w:rPr>
+                <w:rFonts w:ascii="Calibri" w:cs="Calibri" w:eastAsia="Calibri" w:hAnsi="Calibri"/>
+                <w:sz w:val="20"/>
+                <w:szCs w:val="20"/>
+              </w:rPr>
+              <w:t xml:space="preserve">KOBİ</w:t>
+            </w:r>
+          </w:p>
+        </w:tc>
+        <w:tc>
+          <w:tcPr>
+            <w:tcMar>
+              <w:top w:type="dxa" w:w="80"/>
+              <w:left w:type="dxa" w:w="120"/>
+              <w:bottom w:type="dxa" w:w="80"/>
+              <w:right w:type="dxa" w:w="120"/>
+            </w:tcMar>
+          </w:tcPr>
+          <w:p>
+            <w:pPr>
+              <w:jc w:val="right"/>
+            </w:pPr>
+            <w:r>
+              <w:rPr>
+                <w:rFonts w:ascii="Calibri" w:cs="Calibri" w:eastAsia="Calibri" w:hAnsi="Calibri"/>
+                <w:sz w:val="20"/>
+                <w:szCs w:val="20"/>
+              </w:rPr>
+              <w:t xml:space="preserve">Orta+Büyük</w:t>
+            </w:r>
+          </w:p>
+        </w:tc>
+        <w:tc>
+          <w:tcPr>
+            <w:tcMar>
+              <w:top w:type="dxa" w:w="80"/>
+              <w:left w:type="dxa" w:w="120"/>
+              <w:bottom w:type="dxa" w:w="80"/>
+              <w:right w:type="dxa" w:w="120"/>
+            </w:tcMar>
+          </w:tcPr>
+          <w:p>
+            <w:pPr>
+              <w:jc w:val="right"/>
+            </w:pPr>
+            <w:r>
+              <w:rPr>
+                <w:rFonts w:ascii="Calibri" w:cs="Calibri" w:eastAsia="Calibri" w:hAnsi="Calibri"/>
+                <w:sz w:val="20"/>
+                <w:szCs w:val="20"/>
+              </w:rPr>
+              <w:t xml:space="preserve">E-ticaret satıcı</w:t>
+            </w:r>
+          </w:p>
+        </w:tc>
+        <w:tc>
+          <w:tcPr>
+            <w:tcMar>
+              <w:top w:type="dxa" w:w="80"/>
+              <w:left w:type="dxa" w:w="120"/>
+              <w:bottom w:type="dxa" w:w="80"/>
+              <w:right w:type="dxa" w:w="120"/>
+            </w:tcMar>
+          </w:tcPr>
+          <w:p>
+            <w:pPr>
+              <w:jc w:val="right"/>
+            </w:pPr>
+            <w:r>
+              <w:rPr>
+                <w:rFonts w:ascii="Calibri" w:cs="Calibri" w:eastAsia="Calibri" w:hAnsi="Calibri"/>
+                <w:sz w:val="20"/>
+                <w:szCs w:val="20"/>
+              </w:rPr>
+              <w:t xml:space="preserve">Mağaza/Şube</w:t>
+            </w:r>
+          </w:p>
+        </w:tc>
+        <w:tc>
+          <w:tcPr>
+            <w:tcMar>
+              <w:top w:type="dxa" w:w="80"/>
+              <w:left w:type="dxa" w:w="120"/>
+              <w:bottom w:type="dxa" w:w="80"/>
+              <w:right w:type="dxa" w:w="120"/>
+            </w:tcMar>
+          </w:tcPr>
+          <w:p>
+            <w:pPr>
+              <w:jc w:val="right"/>
+            </w:pPr>
+            <w:r>
+              <w:rPr>
+                <w:rFonts w:ascii="Calibri" w:cs="Calibri" w:eastAsia="Calibri" w:hAnsi="Calibri"/>
+                <w:sz w:val="20"/>
+                <w:szCs w:val="20"/>
+              </w:rPr>
+              <w:t xml:space="preserve">Niş ihtiyaç</w:t>
+            </w:r>
+          </w:p>
+        </w:tc>
+        <w:tc>
+          <w:tcPr>
+            <w:tcMar>
+              <w:top w:type="dxa" w:w="80"/>
+              <w:left w:type="dxa" w:w="120"/>
+              <w:bottom w:type="dxa" w:w="80"/>
+              <w:right w:type="dxa" w:w="120"/>
+            </w:tcMar>
+          </w:tcPr>
+          <w:p>
+            <w:pPr>
+              <w:jc w:val="right"/>
+            </w:pPr>
+            <w:r>
+              <w:rPr>
+                <w:rFonts w:ascii="Calibri" w:cs="Calibri" w:eastAsia="Calibri" w:hAnsi="Calibri"/>
+                <w:sz w:val="20"/>
+                <w:szCs w:val="20"/>
+              </w:rPr>
+              <w:t xml:space="preserve">KOBİ + büyüyen orta</w:t>
+            </w:r>
+          </w:p>
+        </w:tc>
+      </w:tr>
+      <w:tr>
+        <w:tc>
+          <w:tcPr>
+            <w:tcMar>
+              <w:top w:type="dxa" w:w="80"/>
+              <w:left w:type="dxa" w:w="120"/>
+              <w:bottom w:type="dxa" w:w="80"/>
+              <w:right w:type="dxa" w:w="120"/>
+            </w:tcMar>
+          </w:tcPr>
+          <w:p>
+            <w:pPr>
+              <w:jc w:val="left"/>
+            </w:pPr>
+            <w:r>
+              <w:rPr>
+                <w:rFonts w:ascii="Calibri" w:cs="Calibri" w:eastAsia="Calibri" w:hAnsi="Calibri"/>
+                <w:b/>
+                <w:bCs/>
+                <w:sz w:val="20"/>
+                <w:szCs w:val="20"/>
+              </w:rPr>
+              <w:t xml:space="preserve">Kurulum süresi</w:t>
+            </w:r>
+          </w:p>
+        </w:tc>
+        <w:tc>
+          <w:tcPr>
+            <w:tcMar>
+              <w:top w:type="dxa" w:w="80"/>
+              <w:left w:type="dxa" w:w="120"/>
+              <w:bottom w:type="dxa" w:w="80"/>
+              <w:right w:type="dxa" w:w="120"/>
+            </w:tcMar>
+          </w:tcPr>
+          <w:p>
+            <w:pPr>
+              <w:jc w:val="right"/>
+            </w:pPr>
+            <w:r>
+              <w:rPr>
+                <w:rFonts w:ascii="Calibri" w:cs="Calibri" w:eastAsia="Calibri" w:hAnsi="Calibri"/>
+                <w:sz w:val="20"/>
+                <w:szCs w:val="20"/>
+              </w:rPr>
+              <w:t xml:space="preserve">Düşük</w:t>
+            </w:r>
+          </w:p>
+        </w:tc>
+        <w:tc>
+          <w:tcPr>
+            <w:tcMar>
+              <w:top w:type="dxa" w:w="80"/>
+              <w:left w:type="dxa" w:w="120"/>
+              <w:bottom w:type="dxa" w:w="80"/>
+              <w:right w:type="dxa" w:w="120"/>
+            </w:tcMar>
+          </w:tcPr>
+          <w:p>
+            <w:pPr>
+              <w:jc w:val="right"/>
+            </w:pPr>
+            <w:r>
+              <w:rPr>
+                <w:rFonts w:ascii="Calibri" w:cs="Calibri" w:eastAsia="Calibri" w:hAnsi="Calibri"/>
+                <w:sz w:val="20"/>
+                <w:szCs w:val="20"/>
+              </w:rPr>
+              <w:t xml:space="preserve">Yüksek</w:t>
+            </w:r>
+          </w:p>
+        </w:tc>
+        <w:tc>
+          <w:tcPr>
+            <w:tcMar>
+              <w:top w:type="dxa" w:w="80"/>
+              <w:left w:type="dxa" w:w="120"/>
+              <w:bottom w:type="dxa" w:w="80"/>
+              <w:right w:type="dxa" w:w="120"/>
+            </w:tcMar>
+          </w:tcPr>
+          <w:p>
+            <w:pPr>
+              <w:jc w:val="right"/>
+            </w:pPr>
+            <w:r>
+              <w:rPr>
+                <w:rFonts w:ascii="Calibri" w:cs="Calibri" w:eastAsia="Calibri" w:hAnsi="Calibri"/>
+                <w:sz w:val="20"/>
+                <w:szCs w:val="20"/>
+              </w:rPr>
+              <w:t xml:space="preserve">Düşük</w:t>
+            </w:r>
+          </w:p>
+        </w:tc>
+        <w:tc>
+          <w:tcPr>
+            <w:tcMar>
+              <w:top w:type="dxa" w:w="80"/>
+              <w:left w:type="dxa" w:w="120"/>
+              <w:bottom w:type="dxa" w:w="80"/>
+              <w:right w:type="dxa" w:w="120"/>
+            </w:tcMar>
+          </w:tcPr>
+          <w:p>
+            <w:pPr>
+              <w:jc w:val="right"/>
+            </w:pPr>
+            <w:r>
+              <w:rPr>
+                <w:rFonts w:ascii="Calibri" w:cs="Calibri" w:eastAsia="Calibri" w:hAnsi="Calibri"/>
+                <w:sz w:val="20"/>
+                <w:szCs w:val="20"/>
+              </w:rPr>
+              <w:t xml:space="preserve">Orta</w:t>
+            </w:r>
+          </w:p>
+        </w:tc>
+        <w:tc>
+          <w:tcPr>
+            <w:tcMar>
+              <w:top w:type="dxa" w:w="80"/>
+              <w:left w:type="dxa" w:w="120"/>
+              <w:bottom w:type="dxa" w:w="80"/>
+              <w:right w:type="dxa" w:w="120"/>
+            </w:tcMar>
+          </w:tcPr>
+          <w:p>
+            <w:pPr>
+              <w:jc w:val="right"/>
+            </w:pPr>
+            <w:r>
+              <w:rPr>
+                <w:rFonts w:ascii="Calibri" w:cs="Calibri" w:eastAsia="Calibri" w:hAnsi="Calibri"/>
+                <w:sz w:val="20"/>
+                <w:szCs w:val="20"/>
+              </w:rPr>
+              <w:t xml:space="preserve">Düşük</w:t>
+            </w:r>
+          </w:p>
+        </w:tc>
+        <w:tc>
+          <w:tcPr>
+            <w:tcMar>
+              <w:top w:type="dxa" w:w="80"/>
+              <w:left w:type="dxa" w:w="120"/>
+              <w:bottom w:type="dxa" w:w="80"/>
+              <w:right w:type="dxa" w:w="120"/>
+            </w:tcMar>
+          </w:tcPr>
+          <w:p>
+            <w:pPr>
+              <w:jc w:val="right"/>
+            </w:pPr>
+            <w:r>
+              <w:rPr>
+                <w:rFonts w:ascii="Calibri" w:cs="Calibri" w:eastAsia="Calibri" w:hAnsi="Calibri"/>
+                <w:sz w:val="20"/>
+                <w:szCs w:val="20"/>
+              </w:rPr>
+              <w:t xml:space="preserve">Düşük</w:t>
+            </w:r>
+          </w:p>
+        </w:tc>
+      </w:tr>
+      <w:tr>
+        <w:tc>
+          <w:tcPr>
+            <w:tcMar>
+              <w:top w:type="dxa" w:w="80"/>
+              <w:left w:type="dxa" w:w="120"/>
+              <w:bottom w:type="dxa" w:w="80"/>
+              <w:right w:type="dxa" w:w="120"/>
+            </w:tcMar>
+          </w:tcPr>
+          <w:p>
+            <w:pPr>
+              <w:jc w:val="left"/>
+            </w:pPr>
+            <w:r>
+              <w:rPr>
+                <w:rFonts w:ascii="Calibri" w:cs="Calibri" w:eastAsia="Calibri" w:hAnsi="Calibri"/>
+                <w:b/>
+                <w:bCs/>
+                <w:sz w:val="20"/>
+                <w:szCs w:val="20"/>
+              </w:rPr>
+              <w:t xml:space="preserve">Ön muhasebe</w:t>
+            </w:r>
+          </w:p>
+        </w:tc>
+        <w:tc>
+          <w:tcPr>
+            <w:tcMar>
+              <w:top w:type="dxa" w:w="80"/>
+              <w:left w:type="dxa" w:w="120"/>
+              <w:bottom w:type="dxa" w:w="80"/>
+              <w:right w:type="dxa" w:w="120"/>
+            </w:tcMar>
+          </w:tcPr>
+          <w:p>
+            <w:pPr>
+              <w:jc w:val="right"/>
+            </w:pPr>
+            <w:r>
+              <w:rPr>
+                <w:rFonts w:ascii="Calibri" w:cs="Calibri" w:eastAsia="Calibri" w:hAnsi="Calibri"/>
+                <w:sz w:val="20"/>
+                <w:szCs w:val="20"/>
+              </w:rPr>
+              <w:t xml:space="preserve">Çekirdek</w:t>
+            </w:r>
+          </w:p>
+        </w:tc>
+        <w:tc>
+          <w:tcPr>
+            <w:tcMar>
+              <w:top w:type="dxa" w:w="80"/>
+              <w:left w:type="dxa" w:w="120"/>
+              <w:bottom w:type="dxa" w:w="80"/>
+              <w:right w:type="dxa" w:w="120"/>
+            </w:tcMar>
+          </w:tcPr>
+          <w:p>
+            <w:pPr>
+              <w:jc w:val="right"/>
+            </w:pPr>
+            <w:r>
+              <w:rPr>
+                <w:rFonts w:ascii="Calibri" w:cs="Calibri" w:eastAsia="Calibri" w:hAnsi="Calibri"/>
+                <w:sz w:val="20"/>
+                <w:szCs w:val="20"/>
+              </w:rPr>
+              <w:t xml:space="preserve">Çekirdek</w:t>
+            </w:r>
+          </w:p>
+        </w:tc>
+        <w:tc>
+          <w:tcPr>
+            <w:tcMar>
+              <w:top w:type="dxa" w:w="80"/>
+              <w:left w:type="dxa" w:w="120"/>
+              <w:bottom w:type="dxa" w:w="80"/>
+              <w:right w:type="dxa" w:w="120"/>
+            </w:tcMar>
+          </w:tcPr>
+          <w:p>
+            <w:pPr>
+              <w:jc w:val="right"/>
+            </w:pPr>
+            <w:r>
+              <w:rPr>
+                <w:rFonts w:ascii="Calibri" w:cs="Calibri" w:eastAsia="Calibri" w:hAnsi="Calibri"/>
+                <w:sz w:val="20"/>
+                <w:szCs w:val="20"/>
+              </w:rPr>
+              <w:t xml:space="preserve">Yok</w:t>
+            </w:r>
+          </w:p>
+        </w:tc>
+        <w:tc>
+          <w:tcPr>
+            <w:tcMar>
+              <w:top w:type="dxa" w:w="80"/>
+              <w:left w:type="dxa" w:w="120"/>
+              <w:bottom w:type="dxa" w:w="80"/>
+              <w:right w:type="dxa" w:w="120"/>
+            </w:tcMar>
+          </w:tcPr>
+          <w:p>
+            <w:pPr>
+              <w:jc w:val="right"/>
+            </w:pPr>
+            <w:r>
+              <w:rPr>
+                <w:rFonts w:ascii="Calibri" w:cs="Calibri" w:eastAsia="Calibri" w:hAnsi="Calibri"/>
+                <w:sz w:val="20"/>
+                <w:szCs w:val="20"/>
+              </w:rPr>
+              <w:t xml:space="preserve">Sınırlı</w:t>
+            </w:r>
+          </w:p>
+        </w:tc>
+        <w:tc>
+          <w:tcPr>
+            <w:tcMar>
+              <w:top w:type="dxa" w:w="80"/>
+              <w:left w:type="dxa" w:w="120"/>
+              <w:bottom w:type="dxa" w:w="80"/>
+              <w:right w:type="dxa" w:w="120"/>
+            </w:tcMar>
+          </w:tcPr>
+          <w:p>
+            <w:pPr>
+              <w:jc w:val="right"/>
+            </w:pPr>
+            <w:r>
+              <w:rPr>
+                <w:rFonts w:ascii="Calibri" w:cs="Calibri" w:eastAsia="Calibri" w:hAnsi="Calibri"/>
+                <w:sz w:val="20"/>
+                <w:szCs w:val="20"/>
+              </w:rPr>
+              <w:t xml:space="preserve">Değişken</w:t>
+            </w:r>
+          </w:p>
+        </w:tc>
+        <w:tc>
+          <w:tcPr>
+            <w:tcMar>
+              <w:top w:type="dxa" w:w="80"/>
+              <w:left w:type="dxa" w:w="120"/>
+              <w:bottom w:type="dxa" w:w="80"/>
+              <w:right w:type="dxa" w:w="120"/>
+            </w:tcMar>
+          </w:tcPr>
+          <w:p>
+            <w:pPr>
+              <w:jc w:val="right"/>
+            </w:pPr>
+            <w:r>
+              <w:rPr>
+                <w:rFonts w:ascii="Calibri" w:cs="Calibri" w:eastAsia="Calibri" w:hAnsi="Calibri"/>
+                <w:sz w:val="20"/>
+                <w:szCs w:val="20"/>
+              </w:rPr>
+              <w:t xml:space="preserve">Çekirdek</w:t>
+            </w:r>
+          </w:p>
+        </w:tc>
+      </w:tr>
+      <w:tr>
+        <w:tc>
+          <w:tcPr>
+            <w:tcMar>
+              <w:top w:type="dxa" w:w="80"/>
+              <w:left w:type="dxa" w:w="120"/>
+              <w:bottom w:type="dxa" w:w="80"/>
+              <w:right w:type="dxa" w:w="120"/>
+            </w:tcMar>
+          </w:tcPr>
+          <w:p>
+            <w:pPr>
+              <w:jc w:val="left"/>
+            </w:pPr>
+            <w:r>
+              <w:rPr>
+                <w:rFonts w:ascii="Calibri" w:cs="Calibri" w:eastAsia="Calibri" w:hAnsi="Calibri"/>
+                <w:b/>
+                <w:bCs/>
+                <w:sz w:val="20"/>
+                <w:szCs w:val="20"/>
+              </w:rPr>
+              <w:t xml:space="preserve">Stok / depo</w:t>
+            </w:r>
+          </w:p>
+        </w:tc>
+        <w:tc>
+          <w:tcPr>
+            <w:tcMar>
+              <w:top w:type="dxa" w:w="80"/>
+              <w:left w:type="dxa" w:w="120"/>
+              <w:bottom w:type="dxa" w:w="80"/>
+              <w:right w:type="dxa" w:w="120"/>
+            </w:tcMar>
+          </w:tcPr>
+          <w:p>
+            <w:pPr>
+              <w:jc w:val="right"/>
+            </w:pPr>
+            <w:r>
+              <w:rPr>
+                <w:rFonts w:ascii="Calibri" w:cs="Calibri" w:eastAsia="Calibri" w:hAnsi="Calibri"/>
+                <w:sz w:val="20"/>
+                <w:szCs w:val="20"/>
+              </w:rPr>
+              <w:t xml:space="preserve">Sınırlı</w:t>
+            </w:r>
+          </w:p>
+        </w:tc>
+        <w:tc>
+          <w:tcPr>
+            <w:tcMar>
+              <w:top w:type="dxa" w:w="80"/>
+              <w:left w:type="dxa" w:w="120"/>
+              <w:bottom w:type="dxa" w:w="80"/>
+              <w:right w:type="dxa" w:w="120"/>
+            </w:tcMar>
+          </w:tcPr>
+          <w:p>
+            <w:pPr>
+              <w:jc w:val="right"/>
+            </w:pPr>
+            <w:r>
+              <w:rPr>
+                <w:rFonts w:ascii="Calibri" w:cs="Calibri" w:eastAsia="Calibri" w:hAnsi="Calibri"/>
+                <w:sz w:val="20"/>
+                <w:szCs w:val="20"/>
+              </w:rPr>
+              <w:t xml:space="preserve">Güçlü</w:t>
+            </w:r>
+          </w:p>
+        </w:tc>
+        <w:tc>
+          <w:tcPr>
+            <w:tcMar>
+              <w:top w:type="dxa" w:w="80"/>
+              <w:left w:type="dxa" w:w="120"/>
+              <w:bottom w:type="dxa" w:w="80"/>
+              <w:right w:type="dxa" w:w="120"/>
+            </w:tcMar>
+          </w:tcPr>
+          <w:p>
+            <w:pPr>
+              <w:jc w:val="right"/>
+            </w:pPr>
+            <w:r>
+              <w:rPr>
+                <w:rFonts w:ascii="Calibri" w:cs="Calibri" w:eastAsia="Calibri" w:hAnsi="Calibri"/>
+                <w:sz w:val="20"/>
+                <w:szCs w:val="20"/>
+              </w:rPr>
+              <w:t xml:space="preserve">Sınırlı</w:t>
+            </w:r>
+          </w:p>
+        </w:tc>
+        <w:tc>
+          <w:tcPr>
+            <w:tcMar>
+              <w:top w:type="dxa" w:w="80"/>
+              <w:left w:type="dxa" w:w="120"/>
+              <w:bottom w:type="dxa" w:w="80"/>
+              <w:right w:type="dxa" w:w="120"/>
+            </w:tcMar>
+          </w:tcPr>
+          <w:p>
+            <w:pPr>
+              <w:jc w:val="right"/>
+            </w:pPr>
+            <w:r>
+              <w:rPr>
+                <w:rFonts w:ascii="Calibri" w:cs="Calibri" w:eastAsia="Calibri" w:hAnsi="Calibri"/>
+                <w:sz w:val="20"/>
+                <w:szCs w:val="20"/>
+              </w:rPr>
+              <w:t xml:space="preserve">Orta</w:t>
+            </w:r>
+          </w:p>
+        </w:tc>
+        <w:tc>
+          <w:tcPr>
+            <w:tcMar>
+              <w:top w:type="dxa" w:w="80"/>
+              <w:left w:type="dxa" w:w="120"/>
+              <w:bottom w:type="dxa" w:w="80"/>
+              <w:right w:type="dxa" w:w="120"/>
+            </w:tcMar>
+          </w:tcPr>
+          <w:p>
+            <w:pPr>
+              <w:jc w:val="right"/>
+            </w:pPr>
+            <w:r>
+              <w:rPr>
+                <w:rFonts w:ascii="Calibri" w:cs="Calibri" w:eastAsia="Calibri" w:hAnsi="Calibri"/>
+                <w:sz w:val="20"/>
+                <w:szCs w:val="20"/>
+              </w:rPr>
+              <w:t xml:space="preserve">Değişken</w:t>
+            </w:r>
+          </w:p>
+        </w:tc>
+        <w:tc>
+          <w:tcPr>
+            <w:tcMar>
+              <w:top w:type="dxa" w:w="80"/>
+              <w:left w:type="dxa" w:w="120"/>
+              <w:bottom w:type="dxa" w:w="80"/>
+              <w:right w:type="dxa" w:w="120"/>
+            </w:tcMar>
+          </w:tcPr>
+          <w:p>
+            <w:pPr>
+              <w:jc w:val="right"/>
+            </w:pPr>
+            <w:r>
+              <w:rPr>
+                <w:rFonts w:ascii="Calibri" w:cs="Calibri" w:eastAsia="Calibri" w:hAnsi="Calibri"/>
+                <w:sz w:val="20"/>
+                <w:szCs w:val="20"/>
+              </w:rPr>
+              <w:t xml:space="preserve">Güçlü</w:t>
+            </w:r>
+          </w:p>
+        </w:tc>
+      </w:tr>
+      <w:tr>
+        <w:tc>
+          <w:tcPr>
+            <w:tcMar>
+              <w:top w:type="dxa" w:w="80"/>
+              <w:left w:type="dxa" w:w="120"/>
+              <w:bottom w:type="dxa" w:w="80"/>
+              <w:right w:type="dxa" w:w="120"/>
+            </w:tcMar>
+          </w:tcPr>
+          <w:p>
+            <w:pPr>
+              <w:jc w:val="left"/>
+            </w:pPr>
+            <w:r>
+              <w:rPr>
+                <w:rFonts w:ascii="Calibri" w:cs="Calibri" w:eastAsia="Calibri" w:hAnsi="Calibri"/>
+                <w:b/>
+                <w:bCs/>
+                <w:sz w:val="20"/>
+                <w:szCs w:val="20"/>
+              </w:rPr>
+              <w:t xml:space="preserve">POS / hızlı satış</w:t>
+            </w:r>
+          </w:p>
+        </w:tc>
+        <w:tc>
+          <w:tcPr>
+            <w:tcMar>
+              <w:top w:type="dxa" w:w="80"/>
+              <w:left w:type="dxa" w:w="120"/>
+              <w:bottom w:type="dxa" w:w="80"/>
+              <w:right w:type="dxa" w:w="120"/>
+            </w:tcMar>
+          </w:tcPr>
+          <w:p>
+            <w:pPr>
+              <w:jc w:val="right"/>
+            </w:pPr>
+            <w:r>
+              <w:rPr>
+                <w:rFonts w:ascii="Calibri" w:cs="Calibri" w:eastAsia="Calibri" w:hAnsi="Calibri"/>
+                <w:sz w:val="20"/>
+                <w:szCs w:val="20"/>
+              </w:rPr>
+              <w:t xml:space="preserve">Yok</w:t>
+            </w:r>
+          </w:p>
+        </w:tc>
+        <w:tc>
+          <w:tcPr>
+            <w:tcMar>
+              <w:top w:type="dxa" w:w="80"/>
+              <w:left w:type="dxa" w:w="120"/>
+              <w:bottom w:type="dxa" w:w="80"/>
+              <w:right w:type="dxa" w:w="120"/>
+            </w:tcMar>
+          </w:tcPr>
+          <w:p>
+            <w:pPr>
+              <w:jc w:val="right"/>
+            </w:pPr>
+            <w:r>
+              <w:rPr>
+                <w:rFonts w:ascii="Calibri" w:cs="Calibri" w:eastAsia="Calibri" w:hAnsi="Calibri"/>
+                <w:sz w:val="20"/>
+                <w:szCs w:val="20"/>
+              </w:rPr>
+              <w:t xml:space="preserve">Modüler</w:t>
+            </w:r>
+          </w:p>
+        </w:tc>
+        <w:tc>
+          <w:tcPr>
+            <w:tcMar>
+              <w:top w:type="dxa" w:w="80"/>
+              <w:left w:type="dxa" w:w="120"/>
+              <w:bottom w:type="dxa" w:w="80"/>
+              <w:right w:type="dxa" w:w="120"/>
+            </w:tcMar>
+          </w:tcPr>
+          <w:p>
+            <w:pPr>
+              <w:jc w:val="right"/>
+            </w:pPr>
+            <w:r>
+              <w:rPr>
+                <w:rFonts w:ascii="Calibri" w:cs="Calibri" w:eastAsia="Calibri" w:hAnsi="Calibri"/>
+                <w:sz w:val="20"/>
+                <w:szCs w:val="20"/>
+              </w:rPr>
+              <w:t xml:space="preserve">Yok</w:t>
+            </w:r>
+          </w:p>
+        </w:tc>
+        <w:tc>
+          <w:tcPr>
+            <w:tcMar>
+              <w:top w:type="dxa" w:w="80"/>
+              <w:left w:type="dxa" w:w="120"/>
+              <w:bottom w:type="dxa" w:w="80"/>
+              <w:right w:type="dxa" w:w="120"/>
+            </w:tcMar>
+          </w:tcPr>
+          <w:p>
+            <w:pPr>
+              <w:jc w:val="right"/>
+            </w:pPr>
+            <w:r>
+              <w:rPr>
+                <w:rFonts w:ascii="Calibri" w:cs="Calibri" w:eastAsia="Calibri" w:hAnsi="Calibri"/>
+                <w:sz w:val="20"/>
+                <w:szCs w:val="20"/>
+              </w:rPr>
+              <w:t xml:space="preserve">Çekirdek</w:t>
+            </w:r>
+          </w:p>
+        </w:tc>
+        <w:tc>
+          <w:tcPr>
+            <w:tcMar>
+              <w:top w:type="dxa" w:w="80"/>
+              <w:left w:type="dxa" w:w="120"/>
+              <w:bottom w:type="dxa" w:w="80"/>
+              <w:right w:type="dxa" w:w="120"/>
+            </w:tcMar>
+          </w:tcPr>
+          <w:p>
+            <w:pPr>
+              <w:jc w:val="right"/>
+            </w:pPr>
+            <w:r>
+              <w:rPr>
+                <w:rFonts w:ascii="Calibri" w:cs="Calibri" w:eastAsia="Calibri" w:hAnsi="Calibri"/>
+                <w:sz w:val="20"/>
+                <w:szCs w:val="20"/>
+              </w:rPr>
+              <w:t xml:space="preserve">Yok</w:t>
+            </w:r>
+          </w:p>
+        </w:tc>
+        <w:tc>
+          <w:tcPr>
+            <w:tcMar>
+              <w:top w:type="dxa" w:w="80"/>
+              <w:left w:type="dxa" w:w="120"/>
+              <w:bottom w:type="dxa" w:w="80"/>
+              <w:right w:type="dxa" w:w="120"/>
+            </w:tcMar>
+          </w:tcPr>
+          <w:p>
+            <w:pPr>
+              <w:jc w:val="right"/>
+            </w:pPr>
+            <w:r>
+              <w:rPr>
+                <w:rFonts w:ascii="Calibri" w:cs="Calibri" w:eastAsia="Calibri" w:hAnsi="Calibri"/>
+                <w:sz w:val="20"/>
+                <w:szCs w:val="20"/>
+              </w:rPr>
+              <w:t xml:space="preserve">Çekirdek</w:t>
+            </w:r>
+          </w:p>
+        </w:tc>
+      </w:tr>
+      <w:tr>
+        <w:tc>
+          <w:tcPr>
+            <w:tcMar>
+              <w:top w:type="dxa" w:w="80"/>
+              <w:left w:type="dxa" w:w="120"/>
+              <w:bottom w:type="dxa" w:w="80"/>
+              <w:right w:type="dxa" w:w="120"/>
+            </w:tcMar>
+          </w:tcPr>
+          <w:p>
+            <w:pPr>
+              <w:jc w:val="left"/>
+            </w:pPr>
+            <w:r>
+              <w:rPr>
+                <w:rFonts w:ascii="Calibri" w:cs="Calibri" w:eastAsia="Calibri" w:hAnsi="Calibri"/>
+                <w:b/>
+                <w:bCs/>
+                <w:sz w:val="20"/>
+                <w:szCs w:val="20"/>
+              </w:rPr>
+              <w:t xml:space="preserve">Pazaryeri sync</w:t>
+            </w:r>
+          </w:p>
+        </w:tc>
+        <w:tc>
+          <w:tcPr>
+            <w:tcMar>
+              <w:top w:type="dxa" w:w="80"/>
+              <w:left w:type="dxa" w:w="120"/>
+              <w:bottom w:type="dxa" w:w="80"/>
+              <w:right w:type="dxa" w:w="120"/>
+            </w:tcMar>
+          </w:tcPr>
+          <w:p>
+            <w:pPr>
+              <w:jc w:val="right"/>
+            </w:pPr>
+            <w:r>
+              <w:rPr>
+                <w:rFonts w:ascii="Calibri" w:cs="Calibri" w:eastAsia="Calibri" w:hAnsi="Calibri"/>
+                <w:sz w:val="20"/>
+                <w:szCs w:val="20"/>
+              </w:rPr>
+              <w:t xml:space="preserve">Eklenti</w:t>
+            </w:r>
+          </w:p>
+        </w:tc>
+        <w:tc>
+          <w:tcPr>
+            <w:tcMar>
+              <w:top w:type="dxa" w:w="80"/>
+              <w:left w:type="dxa" w:w="120"/>
+              <w:bottom w:type="dxa" w:w="80"/>
+              <w:right w:type="dxa" w:w="120"/>
+            </w:tcMar>
+          </w:tcPr>
+          <w:p>
+            <w:pPr>
+              <w:jc w:val="right"/>
+            </w:pPr>
+            <w:r>
+              <w:rPr>
+                <w:rFonts w:ascii="Calibri" w:cs="Calibri" w:eastAsia="Calibri" w:hAnsi="Calibri"/>
+                <w:sz w:val="20"/>
+                <w:szCs w:val="20"/>
+              </w:rPr>
+              <w:t xml:space="preserve">Sınırlı</w:t>
+            </w:r>
+          </w:p>
+        </w:tc>
+        <w:tc>
+          <w:tcPr>
+            <w:tcMar>
+              <w:top w:type="dxa" w:w="80"/>
+              <w:left w:type="dxa" w:w="120"/>
+              <w:bottom w:type="dxa" w:w="80"/>
+              <w:right w:type="dxa" w:w="120"/>
+            </w:tcMar>
+          </w:tcPr>
+          <w:p>
+            <w:pPr>
+              <w:jc w:val="right"/>
+            </w:pPr>
+            <w:r>
+              <w:rPr>
+                <w:rFonts w:ascii="Calibri" w:cs="Calibri" w:eastAsia="Calibri" w:hAnsi="Calibri"/>
+                <w:sz w:val="20"/>
+                <w:szCs w:val="20"/>
+              </w:rPr>
+              <w:t xml:space="preserve">Çekirdek</w:t>
+            </w:r>
+          </w:p>
+        </w:tc>
+        <w:tc>
+          <w:tcPr>
+            <w:tcMar>
+              <w:top w:type="dxa" w:w="80"/>
+              <w:left w:type="dxa" w:w="120"/>
+              <w:bottom w:type="dxa" w:w="80"/>
+              <w:right w:type="dxa" w:w="120"/>
+            </w:tcMar>
+          </w:tcPr>
+          <w:p>
+            <w:pPr>
+              <w:jc w:val="right"/>
+            </w:pPr>
+            <w:r>
+              <w:rPr>
+                <w:rFonts w:ascii="Calibri" w:cs="Calibri" w:eastAsia="Calibri" w:hAnsi="Calibri"/>
+                <w:sz w:val="20"/>
+                <w:szCs w:val="20"/>
+              </w:rPr>
+              <w:t xml:space="preserve">Yok</w:t>
+            </w:r>
+          </w:p>
+        </w:tc>
+        <w:tc>
+          <w:tcPr>
+            <w:tcMar>
+              <w:top w:type="dxa" w:w="80"/>
+              <w:left w:type="dxa" w:w="120"/>
+              <w:bottom w:type="dxa" w:w="80"/>
+              <w:right w:type="dxa" w:w="120"/>
+            </w:tcMar>
+          </w:tcPr>
+          <w:p>
+            <w:pPr>
+              <w:jc w:val="right"/>
+            </w:pPr>
+            <w:r>
+              <w:rPr>
+                <w:rFonts w:ascii="Calibri" w:cs="Calibri" w:eastAsia="Calibri" w:hAnsi="Calibri"/>
+                <w:sz w:val="20"/>
+                <w:szCs w:val="20"/>
+              </w:rPr>
+              <w:t xml:space="preserve">Bazıları çekirdek</w:t>
+            </w:r>
+          </w:p>
+        </w:tc>
+        <w:tc>
+          <w:tcPr>
+            <w:tcMar>
+              <w:top w:type="dxa" w:w="80"/>
+              <w:left w:type="dxa" w:w="120"/>
+              <w:bottom w:type="dxa" w:w="80"/>
+              <w:right w:type="dxa" w:w="120"/>
+            </w:tcMar>
+          </w:tcPr>
+          <w:p>
+            <w:pPr>
+              <w:jc w:val="right"/>
+            </w:pPr>
+            <w:r>
+              <w:rPr>
+                <w:rFonts w:ascii="Calibri" w:cs="Calibri" w:eastAsia="Calibri" w:hAnsi="Calibri"/>
+                <w:sz w:val="20"/>
+                <w:szCs w:val="20"/>
+              </w:rPr>
+              <w:t xml:space="preserve">Çekirdek</w:t>
+            </w:r>
+          </w:p>
+        </w:tc>
+      </w:tr>
+      <w:tr>
+        <w:tc>
+          <w:tcPr>
+            <w:tcMar>
+              <w:top w:type="dxa" w:w="80"/>
+              <w:left w:type="dxa" w:w="120"/>
+              <w:bottom w:type="dxa" w:w="80"/>
+              <w:right w:type="dxa" w:w="120"/>
+            </w:tcMar>
+          </w:tcPr>
+          <w:p>
+            <w:pPr>
+              <w:jc w:val="left"/>
+            </w:pPr>
+            <w:r>
+              <w:rPr>
+                <w:rFonts w:ascii="Calibri" w:cs="Calibri" w:eastAsia="Calibri" w:hAnsi="Calibri"/>
+                <w:b/>
+                <w:bCs/>
+                <w:sz w:val="20"/>
+                <w:szCs w:val="20"/>
+              </w:rPr>
+              <w:t xml:space="preserve">Gerçek karlılık</w:t>
+            </w:r>
+          </w:p>
+        </w:tc>
+        <w:tc>
+          <w:tcPr>
+            <w:tcMar>
+              <w:top w:type="dxa" w:w="80"/>
+              <w:left w:type="dxa" w:w="120"/>
+              <w:bottom w:type="dxa" w:w="80"/>
+              <w:right w:type="dxa" w:w="120"/>
+            </w:tcMar>
+          </w:tcPr>
+          <w:p>
+            <w:pPr>
+              <w:jc w:val="right"/>
+            </w:pPr>
+            <w:r>
+              <w:rPr>
+                <w:rFonts w:ascii="Calibri" w:cs="Calibri" w:eastAsia="Calibri" w:hAnsi="Calibri"/>
+                <w:sz w:val="20"/>
+                <w:szCs w:val="20"/>
+              </w:rPr>
+              <w:t xml:space="preserve">Sadece ciro</w:t>
+            </w:r>
+          </w:p>
+        </w:tc>
+        <w:tc>
+          <w:tcPr>
+            <w:tcMar>
+              <w:top w:type="dxa" w:w="80"/>
+              <w:left w:type="dxa" w:w="120"/>
+              <w:bottom w:type="dxa" w:w="80"/>
+              <w:right w:type="dxa" w:w="120"/>
+            </w:tcMar>
+          </w:tcPr>
+          <w:p>
+            <w:pPr>
+              <w:jc w:val="right"/>
+            </w:pPr>
+            <w:r>
+              <w:rPr>
+                <w:rFonts w:ascii="Calibri" w:cs="Calibri" w:eastAsia="Calibri" w:hAnsi="Calibri"/>
+                <w:sz w:val="20"/>
+                <w:szCs w:val="20"/>
+              </w:rPr>
+              <w:t xml:space="preserve">Karmaşık raporlar</w:t>
+            </w:r>
+          </w:p>
+        </w:tc>
+        <w:tc>
+          <w:tcPr>
+            <w:tcMar>
+              <w:top w:type="dxa" w:w="80"/>
+              <w:left w:type="dxa" w:w="120"/>
+              <w:bottom w:type="dxa" w:w="80"/>
+              <w:right w:type="dxa" w:w="120"/>
+            </w:tcMar>
+          </w:tcPr>
+          <w:p>
+            <w:pPr>
+              <w:jc w:val="right"/>
+            </w:pPr>
+            <w:r>
+              <w:rPr>
+                <w:rFonts w:ascii="Calibri" w:cs="Calibri" w:eastAsia="Calibri" w:hAnsi="Calibri"/>
+                <w:sz w:val="20"/>
+                <w:szCs w:val="20"/>
+              </w:rPr>
+              <w:t xml:space="preserve">Kısmi</w:t>
+            </w:r>
+          </w:p>
+        </w:tc>
+        <w:tc>
+          <w:tcPr>
+            <w:tcMar>
+              <w:top w:type="dxa" w:w="80"/>
+              <w:left w:type="dxa" w:w="120"/>
+              <w:bottom w:type="dxa" w:w="80"/>
+              <w:right w:type="dxa" w:w="120"/>
+            </w:tcMar>
+          </w:tcPr>
+          <w:p>
+            <w:pPr>
+              <w:jc w:val="right"/>
+            </w:pPr>
+            <w:r>
+              <w:rPr>
+                <w:rFonts w:ascii="Calibri" w:cs="Calibri" w:eastAsia="Calibri" w:hAnsi="Calibri"/>
+                <w:sz w:val="20"/>
+                <w:szCs w:val="20"/>
+              </w:rPr>
+              <w:t xml:space="preserve">Yok</w:t>
+            </w:r>
+          </w:p>
+        </w:tc>
+        <w:tc>
+          <w:tcPr>
+            <w:tcMar>
+              <w:top w:type="dxa" w:w="80"/>
+              <w:left w:type="dxa" w:w="120"/>
+              <w:bottom w:type="dxa" w:w="80"/>
+              <w:right w:type="dxa" w:w="120"/>
+            </w:tcMar>
+          </w:tcPr>
+          <w:p>
+            <w:pPr>
+              <w:jc w:val="right"/>
+            </w:pPr>
+            <w:r>
+              <w:rPr>
+                <w:rFonts w:ascii="Calibri" w:cs="Calibri" w:eastAsia="Calibri" w:hAnsi="Calibri"/>
+                <w:sz w:val="20"/>
+                <w:szCs w:val="20"/>
+              </w:rPr>
+              <w:t xml:space="preserve">Yok</w:t>
+            </w:r>
+          </w:p>
+        </w:tc>
+        <w:tc>
+          <w:tcPr>
+            <w:tcMar>
+              <w:top w:type="dxa" w:w="80"/>
+              <w:left w:type="dxa" w:w="120"/>
+              <w:bottom w:type="dxa" w:w="80"/>
+              <w:right w:type="dxa" w:w="120"/>
+            </w:tcMar>
+          </w:tcPr>
+          <w:p>
+            <w:pPr>
+              <w:jc w:val="right"/>
+            </w:pPr>
+            <w:r>
+              <w:rPr>
+                <w:rFonts w:ascii="Calibri" w:cs="Calibri" w:eastAsia="Calibri" w:hAnsi="Calibri"/>
+                <w:sz w:val="20"/>
+                <w:szCs w:val="20"/>
+              </w:rPr>
+              <w:t xml:space="preserve">Çekirdek (ürün bazlı net kâr)</w:t>
+            </w:r>
+          </w:p>
+        </w:tc>
+      </w:tr>
+      <w:tr>
+        <w:tc>
+          <w:tcPr>
+            <w:tcMar>
+              <w:top w:type="dxa" w:w="80"/>
+              <w:left w:type="dxa" w:w="120"/>
+              <w:bottom w:type="dxa" w:w="80"/>
+              <w:right w:type="dxa" w:w="120"/>
+            </w:tcMar>
+          </w:tcPr>
+          <w:p>
+            <w:pPr>
+              <w:jc w:val="left"/>
+            </w:pPr>
+            <w:r>
+              <w:rPr>
+                <w:rFonts w:ascii="Calibri" w:cs="Calibri" w:eastAsia="Calibri" w:hAnsi="Calibri"/>
+                <w:b/>
+                <w:bCs/>
+                <w:sz w:val="20"/>
+                <w:szCs w:val="20"/>
+              </w:rPr>
+              <w:t xml:space="preserve">Çoklu kanal birleşik</w:t>
+            </w:r>
+          </w:p>
+        </w:tc>
+        <w:tc>
+          <w:tcPr>
+            <w:tcMar>
+              <w:top w:type="dxa" w:w="80"/>
+              <w:left w:type="dxa" w:w="120"/>
+              <w:bottom w:type="dxa" w:w="80"/>
+              <w:right w:type="dxa" w:w="120"/>
+            </w:tcMar>
+          </w:tcPr>
+          <w:p>
+            <w:pPr>
+              <w:jc w:val="right"/>
+            </w:pPr>
+            <w:r>
+              <w:rPr>
+                <w:rFonts w:ascii="Calibri" w:cs="Calibri" w:eastAsia="Calibri" w:hAnsi="Calibri"/>
+                <w:sz w:val="20"/>
+                <w:szCs w:val="20"/>
+              </w:rPr>
+              <w:t xml:space="preserve">Hayır</w:t>
+            </w:r>
+          </w:p>
+        </w:tc>
+        <w:tc>
+          <w:tcPr>
+            <w:tcMar>
+              <w:top w:type="dxa" w:w="80"/>
+              <w:left w:type="dxa" w:w="120"/>
+              <w:bottom w:type="dxa" w:w="80"/>
+              <w:right w:type="dxa" w:w="120"/>
+            </w:tcMar>
+          </w:tcPr>
+          <w:p>
+            <w:pPr>
+              <w:jc w:val="right"/>
+            </w:pPr>
+            <w:r>
+              <w:rPr>
+                <w:rFonts w:ascii="Calibri" w:cs="Calibri" w:eastAsia="Calibri" w:hAnsi="Calibri"/>
+                <w:sz w:val="20"/>
+                <w:szCs w:val="20"/>
+              </w:rPr>
+              <w:t xml:space="preserve">Kısmi</w:t>
+            </w:r>
+          </w:p>
+        </w:tc>
+        <w:tc>
+          <w:tcPr>
+            <w:tcMar>
+              <w:top w:type="dxa" w:w="80"/>
+              <w:left w:type="dxa" w:w="120"/>
+              <w:bottom w:type="dxa" w:w="80"/>
+              <w:right w:type="dxa" w:w="120"/>
+            </w:tcMar>
+          </w:tcPr>
+          <w:p>
+            <w:pPr>
+              <w:jc w:val="right"/>
+            </w:pPr>
+            <w:r>
+              <w:rPr>
+                <w:rFonts w:ascii="Calibri" w:cs="Calibri" w:eastAsia="Calibri" w:hAnsi="Calibri"/>
+                <w:sz w:val="20"/>
+                <w:szCs w:val="20"/>
+              </w:rPr>
+              <w:t xml:space="preserve">Sadece pazaryerleri</w:t>
+            </w:r>
+          </w:p>
+        </w:tc>
+        <w:tc>
+          <w:tcPr>
+            <w:tcMar>
+              <w:top w:type="dxa" w:w="80"/>
+              <w:left w:type="dxa" w:w="120"/>
+              <w:bottom w:type="dxa" w:w="80"/>
+              <w:right w:type="dxa" w:w="120"/>
+            </w:tcMar>
+          </w:tcPr>
+          <w:p>
+            <w:pPr>
+              <w:jc w:val="right"/>
+            </w:pPr>
+            <w:r>
+              <w:rPr>
+                <w:rFonts w:ascii="Calibri" w:cs="Calibri" w:eastAsia="Calibri" w:hAnsi="Calibri"/>
+                <w:sz w:val="20"/>
+                <w:szCs w:val="20"/>
+              </w:rPr>
+              <w:t xml:space="preserve">Hayır</w:t>
+            </w:r>
+          </w:p>
+        </w:tc>
+        <w:tc>
+          <w:tcPr>
+            <w:tcMar>
+              <w:top w:type="dxa" w:w="80"/>
+              <w:left w:type="dxa" w:w="120"/>
+              <w:bottom w:type="dxa" w:w="80"/>
+              <w:right w:type="dxa" w:w="120"/>
+            </w:tcMar>
+          </w:tcPr>
+          <w:p>
+            <w:pPr>
+              <w:jc w:val="right"/>
+            </w:pPr>
+            <w:r>
+              <w:rPr>
+                <w:rFonts w:ascii="Calibri" w:cs="Calibri" w:eastAsia="Calibri" w:hAnsi="Calibri"/>
+                <w:sz w:val="20"/>
+                <w:szCs w:val="20"/>
+              </w:rPr>
+              <w:t xml:space="preserve">Hayır</w:t>
+            </w:r>
+          </w:p>
+        </w:tc>
+        <w:tc>
+          <w:tcPr>
+            <w:tcMar>
+              <w:top w:type="dxa" w:w="80"/>
+              <w:left w:type="dxa" w:w="120"/>
+              <w:bottom w:type="dxa" w:w="80"/>
+              <w:right w:type="dxa" w:w="120"/>
+            </w:tcMar>
+          </w:tcPr>
+          <w:p>
+            <w:pPr>
+              <w:jc w:val="right"/>
+            </w:pPr>
+            <w:r>
+              <w:rPr>
+                <w:rFonts w:ascii="Calibri" w:cs="Calibri" w:eastAsia="Calibri" w:hAnsi="Calibri"/>
+                <w:sz w:val="20"/>
+                <w:szCs w:val="20"/>
+              </w:rPr>
+              <w:t xml:space="preserve">Evet (kanal-agnostik)</w:t>
+            </w:r>
+          </w:p>
+        </w:tc>
+      </w:tr>
+      <w:tr>
+        <w:tc>
+          <w:tcPr>
+            <w:tcMar>
+              <w:top w:type="dxa" w:w="80"/>
+              <w:left w:type="dxa" w:w="120"/>
+              <w:bottom w:type="dxa" w:w="80"/>
+              <w:right w:type="dxa" w:w="120"/>
+            </w:tcMar>
+          </w:tcPr>
+          <w:p>
+            <w:pPr>
+              <w:jc w:val="left"/>
+            </w:pPr>
+            <w:r>
+              <w:rPr>
+                <w:rFonts w:ascii="Calibri" w:cs="Calibri" w:eastAsia="Calibri" w:hAnsi="Calibri"/>
+                <w:b/>
+                <w:bCs/>
+                <w:sz w:val="20"/>
+                <w:szCs w:val="20"/>
+              </w:rPr>
+              <w:t xml:space="preserve">Çoklu para birimi</w:t>
+            </w:r>
+          </w:p>
+        </w:tc>
+        <w:tc>
+          <w:tcPr>
+            <w:tcMar>
+              <w:top w:type="dxa" w:w="80"/>
+              <w:left w:type="dxa" w:w="120"/>
+              <w:bottom w:type="dxa" w:w="80"/>
+              <w:right w:type="dxa" w:w="120"/>
+            </w:tcMar>
+          </w:tcPr>
+          <w:p>
+            <w:pPr>
+              <w:jc w:val="right"/>
+            </w:pPr>
+            <w:r>
+              <w:rPr>
+                <w:rFonts w:ascii="Calibri" w:cs="Calibri" w:eastAsia="Calibri" w:hAnsi="Calibri"/>
+                <w:sz w:val="20"/>
+                <w:szCs w:val="20"/>
+              </w:rPr>
+              <w:t xml:space="preserve">Sınırlı</w:t>
+            </w:r>
+          </w:p>
+        </w:tc>
+        <w:tc>
+          <w:tcPr>
+            <w:tcMar>
+              <w:top w:type="dxa" w:w="80"/>
+              <w:left w:type="dxa" w:w="120"/>
+              <w:bottom w:type="dxa" w:w="80"/>
+              <w:right w:type="dxa" w:w="120"/>
+            </w:tcMar>
+          </w:tcPr>
+          <w:p>
+            <w:pPr>
+              <w:jc w:val="right"/>
+            </w:pPr>
+            <w:r>
+              <w:rPr>
+                <w:rFonts w:ascii="Calibri" w:cs="Calibri" w:eastAsia="Calibri" w:hAnsi="Calibri"/>
+                <w:sz w:val="20"/>
+                <w:szCs w:val="20"/>
+              </w:rPr>
+              <w:t xml:space="preserve">Var</w:t>
+            </w:r>
+          </w:p>
+        </w:tc>
+        <w:tc>
+          <w:tcPr>
+            <w:tcMar>
+              <w:top w:type="dxa" w:w="80"/>
+              <w:left w:type="dxa" w:w="120"/>
+              <w:bottom w:type="dxa" w:w="80"/>
+              <w:right w:type="dxa" w:w="120"/>
+            </w:tcMar>
+          </w:tcPr>
+          <w:p>
+            <w:pPr>
+              <w:jc w:val="right"/>
+            </w:pPr>
+            <w:r>
+              <w:rPr>
+                <w:rFonts w:ascii="Calibri" w:cs="Calibri" w:eastAsia="Calibri" w:hAnsi="Calibri"/>
+                <w:sz w:val="20"/>
+                <w:szCs w:val="20"/>
+              </w:rPr>
+              <w:t xml:space="preserve">Sınırlı</w:t>
+            </w:r>
+          </w:p>
+        </w:tc>
+        <w:tc>
+          <w:tcPr>
+            <w:tcMar>
+              <w:top w:type="dxa" w:w="80"/>
+              <w:left w:type="dxa" w:w="120"/>
+              <w:bottom w:type="dxa" w:w="80"/>
+              <w:right w:type="dxa" w:w="120"/>
+            </w:tcMar>
+          </w:tcPr>
+          <w:p>
+            <w:pPr>
+              <w:jc w:val="right"/>
+            </w:pPr>
+            <w:r>
+              <w:rPr>
+                <w:rFonts w:ascii="Calibri" w:cs="Calibri" w:eastAsia="Calibri" w:hAnsi="Calibri"/>
+                <w:sz w:val="20"/>
+                <w:szCs w:val="20"/>
+              </w:rPr>
+              <w:t xml:space="preserve">Yok</w:t>
+            </w:r>
+          </w:p>
+        </w:tc>
+        <w:tc>
+          <w:tcPr>
+            <w:tcMar>
+              <w:top w:type="dxa" w:w="80"/>
+              <w:left w:type="dxa" w:w="120"/>
+              <w:bottom w:type="dxa" w:w="80"/>
+              <w:right w:type="dxa" w:w="120"/>
+            </w:tcMar>
+          </w:tcPr>
+          <w:p>
+            <w:pPr>
+              <w:jc w:val="right"/>
+            </w:pPr>
+            <w:r>
+              <w:rPr>
+                <w:rFonts w:ascii="Calibri" w:cs="Calibri" w:eastAsia="Calibri" w:hAnsi="Calibri"/>
+                <w:sz w:val="20"/>
+                <w:szCs w:val="20"/>
+              </w:rPr>
+              <w:t xml:space="preserve">Değişken</w:t>
+            </w:r>
+          </w:p>
+        </w:tc>
+        <w:tc>
+          <w:tcPr>
+            <w:tcMar>
+              <w:top w:type="dxa" w:w="80"/>
+              <w:left w:type="dxa" w:w="120"/>
+              <w:bottom w:type="dxa" w:w="80"/>
+              <w:right w:type="dxa" w:w="120"/>
+            </w:tcMar>
+          </w:tcPr>
+          <w:p>
+            <w:pPr>
+              <w:jc w:val="right"/>
+            </w:pPr>
+            <w:r>
+              <w:rPr>
+                <w:rFonts w:ascii="Calibri" w:cs="Calibri" w:eastAsia="Calibri" w:hAnsi="Calibri"/>
+                <w:sz w:val="20"/>
+                <w:szCs w:val="20"/>
+              </w:rPr>
+              <w:t xml:space="preserve">Var (TCMB entegre)</w:t>
+            </w:r>
+          </w:p>
+        </w:tc>
+      </w:tr>
+      <w:tr>
+        <w:tc>
+          <w:tcPr>
+            <w:tcMar>
+              <w:top w:type="dxa" w:w="80"/>
+              <w:left w:type="dxa" w:w="120"/>
+              <w:bottom w:type="dxa" w:w="80"/>
+              <w:right w:type="dxa" w:w="120"/>
+            </w:tcMar>
+          </w:tcPr>
+          <w:p>
+            <w:pPr>
+              <w:jc w:val="left"/>
+            </w:pPr>
+            <w:r>
+              <w:rPr>
+                <w:rFonts w:ascii="Calibri" w:cs="Calibri" w:eastAsia="Calibri" w:hAnsi="Calibri"/>
+                <w:b/>
+                <w:bCs/>
+                <w:sz w:val="20"/>
+                <w:szCs w:val="20"/>
+              </w:rPr>
+              <w:t xml:space="preserve">E-fatura</w:t>
+            </w:r>
+          </w:p>
+        </w:tc>
+        <w:tc>
+          <w:tcPr>
+            <w:tcMar>
+              <w:top w:type="dxa" w:w="80"/>
+              <w:left w:type="dxa" w:w="120"/>
+              <w:bottom w:type="dxa" w:w="80"/>
+              <w:right w:type="dxa" w:w="120"/>
+            </w:tcMar>
+          </w:tcPr>
+          <w:p>
+            <w:pPr>
+              <w:jc w:val="right"/>
+            </w:pPr>
+            <w:r>
+              <w:rPr>
+                <w:rFonts w:ascii="Calibri" w:cs="Calibri" w:eastAsia="Calibri" w:hAnsi="Calibri"/>
+                <w:sz w:val="20"/>
+                <w:szCs w:val="20"/>
+              </w:rPr>
+              <w:t xml:space="preserve">Eklenti / 3.parti</w:t>
+            </w:r>
+          </w:p>
+        </w:tc>
+        <w:tc>
+          <w:tcPr>
+            <w:tcMar>
+              <w:top w:type="dxa" w:w="80"/>
+              <w:left w:type="dxa" w:w="120"/>
+              <w:bottom w:type="dxa" w:w="80"/>
+              <w:right w:type="dxa" w:w="120"/>
+            </w:tcMar>
+          </w:tcPr>
+          <w:p>
+            <w:pPr>
+              <w:jc w:val="right"/>
+            </w:pPr>
+            <w:r>
+              <w:rPr>
+                <w:rFonts w:ascii="Calibri" w:cs="Calibri" w:eastAsia="Calibri" w:hAnsi="Calibri"/>
+                <w:sz w:val="20"/>
+                <w:szCs w:val="20"/>
+              </w:rPr>
+              <w:t xml:space="preserve">Var</w:t>
+            </w:r>
+          </w:p>
+        </w:tc>
+        <w:tc>
+          <w:tcPr>
+            <w:tcMar>
+              <w:top w:type="dxa" w:w="80"/>
+              <w:left w:type="dxa" w:w="120"/>
+              <w:bottom w:type="dxa" w:w="80"/>
+              <w:right w:type="dxa" w:w="120"/>
+            </w:tcMar>
+          </w:tcPr>
+          <w:p>
+            <w:pPr>
+              <w:jc w:val="right"/>
+            </w:pPr>
+            <w:r>
+              <w:rPr>
+                <w:rFonts w:ascii="Calibri" w:cs="Calibri" w:eastAsia="Calibri" w:hAnsi="Calibri"/>
+                <w:sz w:val="20"/>
+                <w:szCs w:val="20"/>
+              </w:rPr>
+              <w:t xml:space="preserve">Yok</w:t>
+            </w:r>
+          </w:p>
+        </w:tc>
+        <w:tc>
+          <w:tcPr>
+            <w:tcMar>
+              <w:top w:type="dxa" w:w="80"/>
+              <w:left w:type="dxa" w:w="120"/>
+              <w:bottom w:type="dxa" w:w="80"/>
+              <w:right w:type="dxa" w:w="120"/>
+            </w:tcMar>
+          </w:tcPr>
+          <w:p>
+            <w:pPr>
+              <w:jc w:val="right"/>
+            </w:pPr>
+            <w:r>
+              <w:rPr>
+                <w:rFonts w:ascii="Calibri" w:cs="Calibri" w:eastAsia="Calibri" w:hAnsi="Calibri"/>
+                <w:sz w:val="20"/>
+                <w:szCs w:val="20"/>
+              </w:rPr>
+              <w:t xml:space="preserve">Eklenti</w:t>
+            </w:r>
+          </w:p>
+        </w:tc>
+        <w:tc>
+          <w:tcPr>
+            <w:tcMar>
+              <w:top w:type="dxa" w:w="80"/>
+              <w:left w:type="dxa" w:w="120"/>
+              <w:bottom w:type="dxa" w:w="80"/>
+              <w:right w:type="dxa" w:w="120"/>
+            </w:tcMar>
+          </w:tcPr>
+          <w:p>
+            <w:pPr>
+              <w:jc w:val="right"/>
+            </w:pPr>
+            <w:r>
+              <w:rPr>
+                <w:rFonts w:ascii="Calibri" w:cs="Calibri" w:eastAsia="Calibri" w:hAnsi="Calibri"/>
+                <w:sz w:val="20"/>
+                <w:szCs w:val="20"/>
+              </w:rPr>
+              <w:t xml:space="preserve">Genelde yok</w:t>
+            </w:r>
+          </w:p>
+        </w:tc>
+        <w:tc>
+          <w:tcPr>
+            <w:tcMar>
+              <w:top w:type="dxa" w:w="80"/>
+              <w:left w:type="dxa" w:w="120"/>
+              <w:bottom w:type="dxa" w:w="80"/>
+              <w:right w:type="dxa" w:w="120"/>
+            </w:tcMar>
+          </w:tcPr>
+          <w:p>
+            <w:pPr>
+              <w:jc w:val="right"/>
+            </w:pPr>
+            <w:r>
+              <w:rPr>
+                <w:rFonts w:ascii="Calibri" w:cs="Calibri" w:eastAsia="Calibri" w:hAnsi="Calibri"/>
+                <w:sz w:val="20"/>
+                <w:szCs w:val="20"/>
+              </w:rPr>
+              <w:t xml:space="preserve">Hazır altyapı</w:t>
+            </w:r>
+          </w:p>
+        </w:tc>
+      </w:tr>
+      <w:tr>
+        <w:tc>
+          <w:tcPr>
+            <w:tcMar>
+              <w:top w:type="dxa" w:w="80"/>
+              <w:left w:type="dxa" w:w="120"/>
+              <w:bottom w:type="dxa" w:w="80"/>
+              <w:right w:type="dxa" w:w="120"/>
+            </w:tcMar>
+          </w:tcPr>
+          <w:p>
+            <w:pPr>
+              <w:jc w:val="left"/>
+            </w:pPr>
+            <w:r>
+              <w:rPr>
+                <w:rFonts w:ascii="Calibri" w:cs="Calibri" w:eastAsia="Calibri" w:hAnsi="Calibri"/>
+                <w:b/>
+                <w:bCs/>
+                <w:sz w:val="20"/>
+                <w:szCs w:val="20"/>
+              </w:rPr>
+              <w:t xml:space="preserve">Multi-tenant</w:t>
+            </w:r>
+          </w:p>
+        </w:tc>
+        <w:tc>
+          <w:tcPr>
+            <w:tcMar>
+              <w:top w:type="dxa" w:w="80"/>
+              <w:left w:type="dxa" w:w="120"/>
+              <w:bottom w:type="dxa" w:w="80"/>
+              <w:right w:type="dxa" w:w="120"/>
+            </w:tcMar>
+          </w:tcPr>
+          <w:p>
+            <w:pPr>
+              <w:jc w:val="right"/>
+            </w:pPr>
+            <w:r>
+              <w:rPr>
+                <w:rFonts w:ascii="Calibri" w:cs="Calibri" w:eastAsia="Calibri" w:hAnsi="Calibri"/>
+                <w:sz w:val="20"/>
+                <w:szCs w:val="20"/>
+              </w:rPr>
+              <w:t xml:space="preserve">Var</w:t>
+            </w:r>
+          </w:p>
+        </w:tc>
+        <w:tc>
+          <w:tcPr>
+            <w:tcMar>
+              <w:top w:type="dxa" w:w="80"/>
+              <w:left w:type="dxa" w:w="120"/>
+              <w:bottom w:type="dxa" w:w="80"/>
+              <w:right w:type="dxa" w:w="120"/>
+            </w:tcMar>
+          </w:tcPr>
+          <w:p>
+            <w:pPr>
+              <w:jc w:val="right"/>
+            </w:pPr>
+            <w:r>
+              <w:rPr>
+                <w:rFonts w:ascii="Calibri" w:cs="Calibri" w:eastAsia="Calibri" w:hAnsi="Calibri"/>
+                <w:sz w:val="20"/>
+                <w:szCs w:val="20"/>
+              </w:rPr>
+              <w:t xml:space="preserve">Genelde yok</w:t>
+            </w:r>
+          </w:p>
+        </w:tc>
+        <w:tc>
+          <w:tcPr>
+            <w:tcMar>
+              <w:top w:type="dxa" w:w="80"/>
+              <w:left w:type="dxa" w:w="120"/>
+              <w:bottom w:type="dxa" w:w="80"/>
+              <w:right w:type="dxa" w:w="120"/>
+            </w:tcMar>
+          </w:tcPr>
+          <w:p>
+            <w:pPr>
+              <w:jc w:val="right"/>
+            </w:pPr>
+            <w:r>
+              <w:rPr>
+                <w:rFonts w:ascii="Calibri" w:cs="Calibri" w:eastAsia="Calibri" w:hAnsi="Calibri"/>
+                <w:sz w:val="20"/>
+                <w:szCs w:val="20"/>
+              </w:rPr>
+              <w:t xml:space="preserve">Var</w:t>
+            </w:r>
+          </w:p>
+        </w:tc>
+        <w:tc>
+          <w:tcPr>
+            <w:tcMar>
+              <w:top w:type="dxa" w:w="80"/>
+              <w:left w:type="dxa" w:w="120"/>
+              <w:bottom w:type="dxa" w:w="80"/>
+              <w:right w:type="dxa" w:w="120"/>
+            </w:tcMar>
+          </w:tcPr>
+          <w:p>
+            <w:pPr>
+              <w:jc w:val="right"/>
+            </w:pPr>
+            <w:r>
+              <w:rPr>
+                <w:rFonts w:ascii="Calibri" w:cs="Calibri" w:eastAsia="Calibri" w:hAnsi="Calibri"/>
+                <w:sz w:val="20"/>
+                <w:szCs w:val="20"/>
+              </w:rPr>
+              <w:t xml:space="preserve">Genelde yok</w:t>
+            </w:r>
+          </w:p>
+        </w:tc>
+        <w:tc>
+          <w:tcPr>
+            <w:tcMar>
+              <w:top w:type="dxa" w:w="80"/>
+              <w:left w:type="dxa" w:w="120"/>
+              <w:bottom w:type="dxa" w:w="80"/>
+              <w:right w:type="dxa" w:w="120"/>
+            </w:tcMar>
+          </w:tcPr>
+          <w:p>
+            <w:pPr>
+              <w:jc w:val="right"/>
+            </w:pPr>
+            <w:r>
+              <w:rPr>
+                <w:rFonts w:ascii="Calibri" w:cs="Calibri" w:eastAsia="Calibri" w:hAnsi="Calibri"/>
+                <w:sz w:val="20"/>
+                <w:szCs w:val="20"/>
+              </w:rPr>
+              <w:t xml:space="preserve">Değişken</w:t>
+            </w:r>
+          </w:p>
+        </w:tc>
+        <w:tc>
+          <w:tcPr>
+            <w:tcMar>
+              <w:top w:type="dxa" w:w="80"/>
+              <w:left w:type="dxa" w:w="120"/>
+              <w:bottom w:type="dxa" w:w="80"/>
+              <w:right w:type="dxa" w:w="120"/>
+            </w:tcMar>
+          </w:tcPr>
+          <w:p>
+            <w:pPr>
+              <w:jc w:val="right"/>
+            </w:pPr>
+            <w:r>
+              <w:rPr>
+                <w:rFonts w:ascii="Calibri" w:cs="Calibri" w:eastAsia="Calibri" w:hAnsi="Calibri"/>
+                <w:sz w:val="20"/>
+                <w:szCs w:val="20"/>
+              </w:rPr>
+              <w:t xml:space="preserve">Var (subdomain izolasyonu)</w:t>
+            </w:r>
+          </w:p>
+        </w:tc>
+      </w:tr>
+      <w:tr>
+        <w:tc>
+          <w:tcPr>
+            <w:tcMar>
+              <w:top w:type="dxa" w:w="80"/>
+              <w:left w:type="dxa" w:w="120"/>
+              <w:bottom w:type="dxa" w:w="80"/>
+              <w:right w:type="dxa" w:w="120"/>
+            </w:tcMar>
+          </w:tcPr>
+          <w:p>
+            <w:pPr>
+              <w:jc w:val="left"/>
+            </w:pPr>
+            <w:r>
+              <w:rPr>
+                <w:rFonts w:ascii="Calibri" w:cs="Calibri" w:eastAsia="Calibri" w:hAnsi="Calibri"/>
+                <w:b/>
+                <w:bCs/>
+                <w:sz w:val="20"/>
+                <w:szCs w:val="20"/>
+              </w:rPr>
+              <w:t xml:space="preserve">Mali müşavir paneli</w:t>
+            </w:r>
+          </w:p>
+        </w:tc>
+        <w:tc>
+          <w:tcPr>
+            <w:tcMar>
+              <w:top w:type="dxa" w:w="80"/>
+              <w:left w:type="dxa" w:w="120"/>
+              <w:bottom w:type="dxa" w:w="80"/>
+              <w:right w:type="dxa" w:w="120"/>
+            </w:tcMar>
+          </w:tcPr>
+          <w:p>
+            <w:pPr>
+              <w:jc w:val="right"/>
+            </w:pPr>
+            <w:r>
+              <w:rPr>
+                <w:rFonts w:ascii="Calibri" w:cs="Calibri" w:eastAsia="Calibri" w:hAnsi="Calibri"/>
+                <w:sz w:val="20"/>
+                <w:szCs w:val="20"/>
+              </w:rPr>
+              <w:t xml:space="preserve">Sınırlı</w:t>
+            </w:r>
+          </w:p>
+        </w:tc>
+        <w:tc>
+          <w:tcPr>
+            <w:tcMar>
+              <w:top w:type="dxa" w:w="80"/>
+              <w:left w:type="dxa" w:w="120"/>
+              <w:bottom w:type="dxa" w:w="80"/>
+              <w:right w:type="dxa" w:w="120"/>
+            </w:tcMar>
+          </w:tcPr>
+          <w:p>
+            <w:pPr>
+              <w:jc w:val="right"/>
+            </w:pPr>
+            <w:r>
+              <w:rPr>
+                <w:rFonts w:ascii="Calibri" w:cs="Calibri" w:eastAsia="Calibri" w:hAnsi="Calibri"/>
+                <w:sz w:val="20"/>
+                <w:szCs w:val="20"/>
+              </w:rPr>
+              <w:t xml:space="preserve">Karmaşık</w:t>
+            </w:r>
+          </w:p>
+        </w:tc>
+        <w:tc>
+          <w:tcPr>
+            <w:tcMar>
+              <w:top w:type="dxa" w:w="80"/>
+              <w:left w:type="dxa" w:w="120"/>
+              <w:bottom w:type="dxa" w:w="80"/>
+              <w:right w:type="dxa" w:w="120"/>
+            </w:tcMar>
+          </w:tcPr>
+          <w:p>
+            <w:pPr>
+              <w:jc w:val="right"/>
+            </w:pPr>
+            <w:r>
+              <w:rPr>
+                <w:rFonts w:ascii="Calibri" w:cs="Calibri" w:eastAsia="Calibri" w:hAnsi="Calibri"/>
+                <w:sz w:val="20"/>
+                <w:szCs w:val="20"/>
+              </w:rPr>
+              <w:t xml:space="preserve">Yok</w:t>
+            </w:r>
+          </w:p>
+        </w:tc>
+        <w:tc>
+          <w:tcPr>
+            <w:tcMar>
+              <w:top w:type="dxa" w:w="80"/>
+              <w:left w:type="dxa" w:w="120"/>
+              <w:bottom w:type="dxa" w:w="80"/>
+              <w:right w:type="dxa" w:w="120"/>
+            </w:tcMar>
+          </w:tcPr>
+          <w:p>
+            <w:pPr>
+              <w:jc w:val="right"/>
+            </w:pPr>
+            <w:r>
+              <w:rPr>
+                <w:rFonts w:ascii="Calibri" w:cs="Calibri" w:eastAsia="Calibri" w:hAnsi="Calibri"/>
+                <w:sz w:val="20"/>
+                <w:szCs w:val="20"/>
+              </w:rPr>
+              <w:t xml:space="preserve">Yok</w:t>
+            </w:r>
+          </w:p>
+        </w:tc>
+        <w:tc>
+          <w:tcPr>
+            <w:tcMar>
+              <w:top w:type="dxa" w:w="80"/>
+              <w:left w:type="dxa" w:w="120"/>
+              <w:bottom w:type="dxa" w:w="80"/>
+              <w:right w:type="dxa" w:w="120"/>
+            </w:tcMar>
+          </w:tcPr>
+          <w:p>
+            <w:pPr>
+              <w:jc w:val="right"/>
+            </w:pPr>
+            <w:r>
+              <w:rPr>
+                <w:rFonts w:ascii="Calibri" w:cs="Calibri" w:eastAsia="Calibri" w:hAnsi="Calibri"/>
+                <w:sz w:val="20"/>
+                <w:szCs w:val="20"/>
+              </w:rPr>
+              <w:t xml:space="preserve">Genelde yok</w:t>
+            </w:r>
+          </w:p>
+        </w:tc>
+        <w:tc>
+          <w:tcPr>
+            <w:tcMar>
+              <w:top w:type="dxa" w:w="80"/>
+              <w:left w:type="dxa" w:w="120"/>
+              <w:bottom w:type="dxa" w:w="80"/>
+              <w:right w:type="dxa" w:w="120"/>
+            </w:tcMar>
+          </w:tcPr>
+          <w:p>
+            <w:pPr>
+              <w:jc w:val="right"/>
+            </w:pPr>
+            <w:r>
+              <w:rPr>
+                <w:rFonts w:ascii="Calibri" w:cs="Calibri" w:eastAsia="Calibri" w:hAnsi="Calibri"/>
+                <w:sz w:val="20"/>
+                <w:szCs w:val="20"/>
+              </w:rPr>
+              <w:t xml:space="preserve">Çekirdek (Kurumsal pakette)</w:t>
+            </w:r>
+          </w:p>
+        </w:tc>
+      </w:tr>
+      <w:tr>
+        <w:tc>
+          <w:tcPr>
+            <w:tcMar>
+              <w:top w:type="dxa" w:w="80"/>
+              <w:left w:type="dxa" w:w="120"/>
+              <w:bottom w:type="dxa" w:w="80"/>
+              <w:right w:type="dxa" w:w="120"/>
+            </w:tcMar>
+          </w:tcPr>
+          <w:p>
+            <w:pPr>
+              <w:jc w:val="left"/>
+            </w:pPr>
+            <w:r>
+              <w:rPr>
+                <w:rFonts w:ascii="Calibri" w:cs="Calibri" w:eastAsia="Calibri" w:hAnsi="Calibri"/>
+                <w:b/>
+                <w:bCs/>
+                <w:sz w:val="20"/>
+                <w:szCs w:val="20"/>
+              </w:rPr>
+              <w:t xml:space="preserve">B2B firma ağı</w:t>
+            </w:r>
+          </w:p>
+        </w:tc>
+        <w:tc>
+          <w:tcPr>
+            <w:tcMar>
+              <w:top w:type="dxa" w:w="80"/>
+              <w:left w:type="dxa" w:w="120"/>
+              <w:bottom w:type="dxa" w:w="80"/>
+              <w:right w:type="dxa" w:w="120"/>
+            </w:tcMar>
+          </w:tcPr>
+          <w:p>
+            <w:pPr>
+              <w:jc w:val="right"/>
+            </w:pPr>
+            <w:r>
+              <w:rPr>
+                <w:rFonts w:ascii="Calibri" w:cs="Calibri" w:eastAsia="Calibri" w:hAnsi="Calibri"/>
+                <w:sz w:val="20"/>
+                <w:szCs w:val="20"/>
+              </w:rPr>
+              <w:t xml:space="preserve">Yok</w:t>
+            </w:r>
+          </w:p>
+        </w:tc>
+        <w:tc>
+          <w:tcPr>
+            <w:tcMar>
+              <w:top w:type="dxa" w:w="80"/>
+              <w:left w:type="dxa" w:w="120"/>
+              <w:bottom w:type="dxa" w:w="80"/>
+              <w:right w:type="dxa" w:w="120"/>
+            </w:tcMar>
+          </w:tcPr>
+          <w:p>
+            <w:pPr>
+              <w:jc w:val="right"/>
+            </w:pPr>
+            <w:r>
+              <w:rPr>
+                <w:rFonts w:ascii="Calibri" w:cs="Calibri" w:eastAsia="Calibri" w:hAnsi="Calibri"/>
+                <w:sz w:val="20"/>
+                <w:szCs w:val="20"/>
+              </w:rPr>
+              <w:t xml:space="preserve">Yok</w:t>
+            </w:r>
+          </w:p>
+        </w:tc>
+        <w:tc>
+          <w:tcPr>
+            <w:tcMar>
+              <w:top w:type="dxa" w:w="80"/>
+              <w:left w:type="dxa" w:w="120"/>
+              <w:bottom w:type="dxa" w:w="80"/>
+              <w:right w:type="dxa" w:w="120"/>
+            </w:tcMar>
+          </w:tcPr>
+          <w:p>
+            <w:pPr>
+              <w:jc w:val="right"/>
+            </w:pPr>
+            <w:r>
+              <w:rPr>
+                <w:rFonts w:ascii="Calibri" w:cs="Calibri" w:eastAsia="Calibri" w:hAnsi="Calibri"/>
+                <w:sz w:val="20"/>
+                <w:szCs w:val="20"/>
+              </w:rPr>
+              <w:t xml:space="preserve">Yok</w:t>
+            </w:r>
+          </w:p>
+        </w:tc>
+        <w:tc>
+          <w:tcPr>
+            <w:tcMar>
+              <w:top w:type="dxa" w:w="80"/>
+              <w:left w:type="dxa" w:w="120"/>
+              <w:bottom w:type="dxa" w:w="80"/>
+              <w:right w:type="dxa" w:w="120"/>
+            </w:tcMar>
+          </w:tcPr>
+          <w:p>
+            <w:pPr>
+              <w:jc w:val="right"/>
+            </w:pPr>
+            <w:r>
+              <w:rPr>
+                <w:rFonts w:ascii="Calibri" w:cs="Calibri" w:eastAsia="Calibri" w:hAnsi="Calibri"/>
+                <w:sz w:val="20"/>
+                <w:szCs w:val="20"/>
+              </w:rPr>
+              <w:t xml:space="preserve">Yok</w:t>
+            </w:r>
+          </w:p>
+        </w:tc>
+        <w:tc>
+          <w:tcPr>
+            <w:tcMar>
+              <w:top w:type="dxa" w:w="80"/>
+              <w:left w:type="dxa" w:w="120"/>
+              <w:bottom w:type="dxa" w:w="80"/>
+              <w:right w:type="dxa" w:w="120"/>
+            </w:tcMar>
+          </w:tcPr>
+          <w:p>
+            <w:pPr>
+              <w:jc w:val="right"/>
+            </w:pPr>
+            <w:r>
+              <w:rPr>
+                <w:rFonts w:ascii="Calibri" w:cs="Calibri" w:eastAsia="Calibri" w:hAnsi="Calibri"/>
+                <w:sz w:val="20"/>
+                <w:szCs w:val="20"/>
+              </w:rPr>
+              <w:t xml:space="preserve">Yok</w:t>
+            </w:r>
+          </w:p>
+        </w:tc>
+        <w:tc>
+          <w:tcPr>
+            <w:tcMar>
+              <w:top w:type="dxa" w:w="80"/>
+              <w:left w:type="dxa" w:w="120"/>
+              <w:bottom w:type="dxa" w:w="80"/>
+              <w:right w:type="dxa" w:w="120"/>
+            </w:tcMar>
+          </w:tcPr>
+          <w:p>
+            <w:pPr>
+              <w:jc w:val="right"/>
+            </w:pPr>
+            <w:r>
+              <w:rPr>
+                <w:rFonts w:ascii="Calibri" w:cs="Calibri" w:eastAsia="Calibri" w:hAnsi="Calibri"/>
+                <w:sz w:val="20"/>
+                <w:szCs w:val="20"/>
+              </w:rPr>
+              <w:t xml:space="preserve">Çekirdek (Faz 4)</w:t>
+            </w:r>
+          </w:p>
+        </w:tc>
+      </w:tr>
+      <w:tr>
+        <w:tc>
+          <w:tcPr>
+            <w:tcMar>
+              <w:top w:type="dxa" w:w="80"/>
+              <w:left w:type="dxa" w:w="120"/>
+              <w:bottom w:type="dxa" w:w="80"/>
+              <w:right w:type="dxa" w:w="120"/>
+            </w:tcMar>
+          </w:tcPr>
+          <w:p>
+            <w:pPr>
+              <w:jc w:val="left"/>
+            </w:pPr>
+            <w:r>
+              <w:rPr>
+                <w:rFonts w:ascii="Calibri" w:cs="Calibri" w:eastAsia="Calibri" w:hAnsi="Calibri"/>
+                <w:b/>
+                <w:bCs/>
+                <w:sz w:val="20"/>
+                <w:szCs w:val="20"/>
+              </w:rPr>
+              <w:t xml:space="preserve">AI fiyat / OCR</w:t>
+            </w:r>
+          </w:p>
+        </w:tc>
+        <w:tc>
+          <w:tcPr>
+            <w:tcMar>
+              <w:top w:type="dxa" w:w="80"/>
+              <w:left w:type="dxa" w:w="120"/>
+              <w:bottom w:type="dxa" w:w="80"/>
+              <w:right w:type="dxa" w:w="120"/>
+            </w:tcMar>
+          </w:tcPr>
+          <w:p>
+            <w:pPr>
+              <w:jc w:val="right"/>
+            </w:pPr>
+            <w:r>
+              <w:rPr>
+                <w:rFonts w:ascii="Calibri" w:cs="Calibri" w:eastAsia="Calibri" w:hAnsi="Calibri"/>
+                <w:sz w:val="20"/>
+                <w:szCs w:val="20"/>
+              </w:rPr>
+              <w:t xml:space="preserve">Erken aşama</w:t>
+            </w:r>
+          </w:p>
+        </w:tc>
+        <w:tc>
+          <w:tcPr>
+            <w:tcMar>
+              <w:top w:type="dxa" w:w="80"/>
+              <w:left w:type="dxa" w:w="120"/>
+              <w:bottom w:type="dxa" w:w="80"/>
+              <w:right w:type="dxa" w:w="120"/>
+            </w:tcMar>
+          </w:tcPr>
+          <w:p>
+            <w:pPr>
+              <w:jc w:val="right"/>
+            </w:pPr>
+            <w:r>
+              <w:rPr>
+                <w:rFonts w:ascii="Calibri" w:cs="Calibri" w:eastAsia="Calibri" w:hAnsi="Calibri"/>
+                <w:sz w:val="20"/>
+                <w:szCs w:val="20"/>
+              </w:rPr>
+              <w:t xml:space="preserve">Geç adapte</w:t>
+            </w:r>
+          </w:p>
+        </w:tc>
+        <w:tc>
+          <w:tcPr>
+            <w:tcMar>
+              <w:top w:type="dxa" w:w="80"/>
+              <w:left w:type="dxa" w:w="120"/>
+              <w:bottom w:type="dxa" w:w="80"/>
+              <w:right w:type="dxa" w:w="120"/>
+            </w:tcMar>
+          </w:tcPr>
+          <w:p>
+            <w:pPr>
+              <w:jc w:val="right"/>
+            </w:pPr>
+            <w:r>
+              <w:rPr>
+                <w:rFonts w:ascii="Calibri" w:cs="Calibri" w:eastAsia="Calibri" w:hAnsi="Calibri"/>
+                <w:sz w:val="20"/>
+                <w:szCs w:val="20"/>
+              </w:rPr>
+              <w:t xml:space="preserve">Sınırlı</w:t>
+            </w:r>
+          </w:p>
+        </w:tc>
+        <w:tc>
+          <w:tcPr>
+            <w:tcMar>
+              <w:top w:type="dxa" w:w="80"/>
+              <w:left w:type="dxa" w:w="120"/>
+              <w:bottom w:type="dxa" w:w="80"/>
+              <w:right w:type="dxa" w:w="120"/>
+            </w:tcMar>
+          </w:tcPr>
+          <w:p>
+            <w:pPr>
+              <w:jc w:val="right"/>
+            </w:pPr>
+            <w:r>
+              <w:rPr>
+                <w:rFonts w:ascii="Calibri" w:cs="Calibri" w:eastAsia="Calibri" w:hAnsi="Calibri"/>
+                <w:sz w:val="20"/>
+                <w:szCs w:val="20"/>
+              </w:rPr>
+              <w:t xml:space="preserve">Yok</w:t>
+            </w:r>
+          </w:p>
+        </w:tc>
+        <w:tc>
+          <w:tcPr>
+            <w:tcMar>
+              <w:top w:type="dxa" w:w="80"/>
+              <w:left w:type="dxa" w:w="120"/>
+              <w:bottom w:type="dxa" w:w="80"/>
+              <w:right w:type="dxa" w:w="120"/>
+            </w:tcMar>
+          </w:tcPr>
+          <w:p>
+            <w:pPr>
+              <w:jc w:val="right"/>
+            </w:pPr>
+            <w:r>
+              <w:rPr>
+                <w:rFonts w:ascii="Calibri" w:cs="Calibri" w:eastAsia="Calibri" w:hAnsi="Calibri"/>
+                <w:sz w:val="20"/>
+                <w:szCs w:val="20"/>
+              </w:rPr>
+              <w:t xml:space="preserve">Bazıları</w:t>
+            </w:r>
+          </w:p>
+        </w:tc>
+        <w:tc>
+          <w:tcPr>
+            <w:tcMar>
+              <w:top w:type="dxa" w:w="80"/>
+              <w:left w:type="dxa" w:w="120"/>
+              <w:bottom w:type="dxa" w:w="80"/>
+              <w:right w:type="dxa" w:w="120"/>
+            </w:tcMar>
+          </w:tcPr>
+          <w:p>
+            <w:pPr>
+              <w:jc w:val="right"/>
+            </w:pPr>
+            <w:r>
+              <w:rPr>
+                <w:rFonts w:ascii="Calibri" w:cs="Calibri" w:eastAsia="Calibri" w:hAnsi="Calibri"/>
+                <w:sz w:val="20"/>
+                <w:szCs w:val="20"/>
+              </w:rPr>
+              <w:t xml:space="preserve">Çekirdek (Faz 5)</w:t>
+            </w:r>
+          </w:p>
+        </w:tc>
+      </w:tr>
+      <w:tr>
+        <w:tc>
+          <w:tcPr>
+            <w:tcMar>
+              <w:top w:type="dxa" w:w="80"/>
+              <w:left w:type="dxa" w:w="120"/>
+              <w:bottom w:type="dxa" w:w="80"/>
+              <w:right w:type="dxa" w:w="120"/>
+            </w:tcMar>
+          </w:tcPr>
+          <w:p>
+            <w:pPr>
+              <w:jc w:val="left"/>
+            </w:pPr>
+            <w:r>
+              <w:rPr>
+                <w:rFonts w:ascii="Calibri" w:cs="Calibri" w:eastAsia="Calibri" w:hAnsi="Calibri"/>
+                <w:b/>
+                <w:bCs/>
+                <w:sz w:val="20"/>
+                <w:szCs w:val="20"/>
+              </w:rPr>
+              <w:t xml:space="preserve">Türkiye-spesifik</w:t>
+            </w:r>
+          </w:p>
+        </w:tc>
+        <w:tc>
+          <w:tcPr>
+            <w:tcMar>
+              <w:top w:type="dxa" w:w="80"/>
+              <w:left w:type="dxa" w:w="120"/>
+              <w:bottom w:type="dxa" w:w="80"/>
+              <w:right w:type="dxa" w:w="120"/>
+            </w:tcMar>
+          </w:tcPr>
+          <w:p>
+            <w:pPr>
+              <w:jc w:val="right"/>
+            </w:pPr>
+            <w:r>
+              <w:rPr>
+                <w:rFonts w:ascii="Calibri" w:cs="Calibri" w:eastAsia="Calibri" w:hAnsi="Calibri"/>
+                <w:sz w:val="20"/>
+                <w:szCs w:val="20"/>
+              </w:rPr>
+              <w:t xml:space="preserve">Yüksek</w:t>
+            </w:r>
+          </w:p>
+        </w:tc>
+        <w:tc>
+          <w:tcPr>
+            <w:tcMar>
+              <w:top w:type="dxa" w:w="80"/>
+              <w:left w:type="dxa" w:w="120"/>
+              <w:bottom w:type="dxa" w:w="80"/>
+              <w:right w:type="dxa" w:w="120"/>
+            </w:tcMar>
+          </w:tcPr>
+          <w:p>
+            <w:pPr>
+              <w:jc w:val="right"/>
+            </w:pPr>
+            <w:r>
+              <w:rPr>
+                <w:rFonts w:ascii="Calibri" w:cs="Calibri" w:eastAsia="Calibri" w:hAnsi="Calibri"/>
+                <w:sz w:val="20"/>
+                <w:szCs w:val="20"/>
+              </w:rPr>
+              <w:t xml:space="preserve">Değişken</w:t>
+            </w:r>
+          </w:p>
+        </w:tc>
+        <w:tc>
+          <w:tcPr>
+            <w:tcMar>
+              <w:top w:type="dxa" w:w="80"/>
+              <w:left w:type="dxa" w:w="120"/>
+              <w:bottom w:type="dxa" w:w="80"/>
+              <w:right w:type="dxa" w:w="120"/>
+            </w:tcMar>
+          </w:tcPr>
+          <w:p>
+            <w:pPr>
+              <w:jc w:val="right"/>
+            </w:pPr>
+            <w:r>
+              <w:rPr>
+                <w:rFonts w:ascii="Calibri" w:cs="Calibri" w:eastAsia="Calibri" w:hAnsi="Calibri"/>
+                <w:sz w:val="20"/>
+                <w:szCs w:val="20"/>
+              </w:rPr>
+              <w:t xml:space="preserve">Yüksek</w:t>
+            </w:r>
+          </w:p>
+        </w:tc>
+        <w:tc>
+          <w:tcPr>
+            <w:tcMar>
+              <w:top w:type="dxa" w:w="80"/>
+              <w:left w:type="dxa" w:w="120"/>
+              <w:bottom w:type="dxa" w:w="80"/>
+              <w:right w:type="dxa" w:w="120"/>
+            </w:tcMar>
+          </w:tcPr>
+          <w:p>
+            <w:pPr>
+              <w:jc w:val="right"/>
+            </w:pPr>
+            <w:r>
+              <w:rPr>
+                <w:rFonts w:ascii="Calibri" w:cs="Calibri" w:eastAsia="Calibri" w:hAnsi="Calibri"/>
+                <w:sz w:val="20"/>
+                <w:szCs w:val="20"/>
+              </w:rPr>
+              <w:t xml:space="preserve">Yüksek</w:t>
+            </w:r>
+          </w:p>
+        </w:tc>
+        <w:tc>
+          <w:tcPr>
+            <w:tcMar>
+              <w:top w:type="dxa" w:w="80"/>
+              <w:left w:type="dxa" w:w="120"/>
+              <w:bottom w:type="dxa" w:w="80"/>
+              <w:right w:type="dxa" w:w="120"/>
+            </w:tcMar>
+          </w:tcPr>
+          <w:p>
+            <w:pPr>
+              <w:jc w:val="right"/>
+            </w:pPr>
+            <w:r>
+              <w:rPr>
+                <w:rFonts w:ascii="Calibri" w:cs="Calibri" w:eastAsia="Calibri" w:hAnsi="Calibri"/>
+                <w:sz w:val="20"/>
+                <w:szCs w:val="20"/>
+              </w:rPr>
+              <w:t xml:space="preserve">Değişken</w:t>
+            </w:r>
+          </w:p>
+        </w:tc>
+        <w:tc>
+          <w:tcPr>
+            <w:tcMar>
+              <w:top w:type="dxa" w:w="80"/>
+              <w:left w:type="dxa" w:w="120"/>
+              <w:bottom w:type="dxa" w:w="80"/>
+              <w:right w:type="dxa" w:w="120"/>
+            </w:tcMar>
+          </w:tcPr>
+          <w:p>
+            <w:pPr>
+              <w:jc w:val="right"/>
+            </w:pPr>
+            <w:r>
+              <w:rPr>
+                <w:rFonts w:ascii="Calibri" w:cs="Calibri" w:eastAsia="Calibri" w:hAnsi="Calibri"/>
+                <w:sz w:val="20"/>
+                <w:szCs w:val="20"/>
+              </w:rPr>
+              <w:t xml:space="preserve">Yüksek (KVKK + GİB günden 1)</w:t>
+            </w:r>
+          </w:p>
+        </w:tc>
+      </w:tr>
+      <w:tr>
+        <w:tc>
+          <w:tcPr>
+            <w:tcMar>
+              <w:top w:type="dxa" w:w="80"/>
+              <w:left w:type="dxa" w:w="120"/>
+              <w:bottom w:type="dxa" w:w="80"/>
+              <w:right w:type="dxa" w:w="120"/>
+            </w:tcMar>
+          </w:tcPr>
+          <w:p>
+            <w:pPr>
+              <w:jc w:val="left"/>
+            </w:pPr>
+            <w:r>
+              <w:rPr>
+                <w:rFonts w:ascii="Calibri" w:cs="Calibri" w:eastAsia="Calibri" w:hAnsi="Calibri"/>
+                <w:b/>
+                <w:bCs/>
+                <w:sz w:val="20"/>
+                <w:szCs w:val="20"/>
+              </w:rPr>
+              <w:t xml:space="preserve">Modern teknoloji</w:t>
+            </w:r>
+          </w:p>
+        </w:tc>
+        <w:tc>
+          <w:tcPr>
+            <w:tcMar>
+              <w:top w:type="dxa" w:w="80"/>
+              <w:left w:type="dxa" w:w="120"/>
+              <w:bottom w:type="dxa" w:w="80"/>
+              <w:right w:type="dxa" w:w="120"/>
+            </w:tcMar>
+          </w:tcPr>
+          <w:p>
+            <w:pPr>
+              <w:jc w:val="right"/>
+            </w:pPr>
+            <w:r>
+              <w:rPr>
+                <w:rFonts w:ascii="Calibri" w:cs="Calibri" w:eastAsia="Calibri" w:hAnsi="Calibri"/>
+                <w:sz w:val="20"/>
+                <w:szCs w:val="20"/>
+              </w:rPr>
+              <w:t xml:space="preserve">Karma</w:t>
+            </w:r>
+          </w:p>
+        </w:tc>
+        <w:tc>
+          <w:tcPr>
+            <w:tcMar>
+              <w:top w:type="dxa" w:w="80"/>
+              <w:left w:type="dxa" w:w="120"/>
+              <w:bottom w:type="dxa" w:w="80"/>
+              <w:right w:type="dxa" w:w="120"/>
+            </w:tcMar>
+          </w:tcPr>
+          <w:p>
+            <w:pPr>
+              <w:jc w:val="right"/>
+            </w:pPr>
+            <w:r>
+              <w:rPr>
+                <w:rFonts w:ascii="Calibri" w:cs="Calibri" w:eastAsia="Calibri" w:hAnsi="Calibri"/>
+                <w:sz w:val="20"/>
+                <w:szCs w:val="20"/>
+              </w:rPr>
+              <w:t xml:space="preserve">Eski (10+ yıl)</w:t>
+            </w:r>
+          </w:p>
+        </w:tc>
+        <w:tc>
+          <w:tcPr>
+            <w:tcMar>
+              <w:top w:type="dxa" w:w="80"/>
+              <w:left w:type="dxa" w:w="120"/>
+              <w:bottom w:type="dxa" w:w="80"/>
+              <w:right w:type="dxa" w:w="120"/>
+            </w:tcMar>
+          </w:tcPr>
+          <w:p>
+            <w:pPr>
+              <w:jc w:val="right"/>
+            </w:pPr>
+            <w:r>
+              <w:rPr>
+                <w:rFonts w:ascii="Calibri" w:cs="Calibri" w:eastAsia="Calibri" w:hAnsi="Calibri"/>
+                <w:sz w:val="20"/>
+                <w:szCs w:val="20"/>
+              </w:rPr>
+              <w:t xml:space="preserve">Modern</w:t>
+            </w:r>
+          </w:p>
+        </w:tc>
+        <w:tc>
+          <w:tcPr>
+            <w:tcMar>
+              <w:top w:type="dxa" w:w="80"/>
+              <w:left w:type="dxa" w:w="120"/>
+              <w:bottom w:type="dxa" w:w="80"/>
+              <w:right w:type="dxa" w:w="120"/>
+            </w:tcMar>
+          </w:tcPr>
+          <w:p>
+            <w:pPr>
+              <w:jc w:val="right"/>
+            </w:pPr>
+            <w:r>
+              <w:rPr>
+                <w:rFonts w:ascii="Calibri" w:cs="Calibri" w:eastAsia="Calibri" w:hAnsi="Calibri"/>
+                <w:sz w:val="20"/>
+                <w:szCs w:val="20"/>
+              </w:rPr>
+              <w:t xml:space="preserve">Karma</w:t>
+            </w:r>
+          </w:p>
+        </w:tc>
+        <w:tc>
+          <w:tcPr>
+            <w:tcMar>
+              <w:top w:type="dxa" w:w="80"/>
+              <w:left w:type="dxa" w:w="120"/>
+              <w:bottom w:type="dxa" w:w="80"/>
+              <w:right w:type="dxa" w:w="120"/>
+            </w:tcMar>
+          </w:tcPr>
+          <w:p>
+            <w:pPr>
+              <w:jc w:val="right"/>
+            </w:pPr>
+            <w:r>
+              <w:rPr>
+                <w:rFonts w:ascii="Calibri" w:cs="Calibri" w:eastAsia="Calibri" w:hAnsi="Calibri"/>
+                <w:sz w:val="20"/>
+                <w:szCs w:val="20"/>
+              </w:rPr>
+              <w:t xml:space="preserve">Modern</w:t>
+            </w:r>
+          </w:p>
+        </w:tc>
+        <w:tc>
+          <w:tcPr>
+            <w:tcMar>
+              <w:top w:type="dxa" w:w="80"/>
+              <w:left w:type="dxa" w:w="120"/>
+              <w:bottom w:type="dxa" w:w="80"/>
+              <w:right w:type="dxa" w:w="120"/>
+            </w:tcMar>
+          </w:tcPr>
+          <w:p>
+            <w:pPr>
+              <w:jc w:val="right"/>
+            </w:pPr>
+            <w:r>
+              <w:rPr>
+                <w:rFonts w:ascii="Calibri" w:cs="Calibri" w:eastAsia="Calibri" w:hAnsi="Calibri"/>
+                <w:sz w:val="20"/>
+                <w:szCs w:val="20"/>
+              </w:rPr>
+              <w:t xml:space="preserve">Modern (TS, multi-tenant)</w:t>
+            </w:r>
+          </w:p>
+        </w:tc>
+      </w:tr>
+      <w:tr>
+        <w:tc>
+          <w:tcPr>
+            <w:tcMar>
+              <w:top w:type="dxa" w:w="80"/>
+              <w:left w:type="dxa" w:w="120"/>
+              <w:bottom w:type="dxa" w:w="80"/>
+              <w:right w:type="dxa" w:w="120"/>
+            </w:tcMar>
+          </w:tcPr>
+          <w:p>
+            <w:pPr>
+              <w:jc w:val="left"/>
+            </w:pPr>
+            <w:r>
+              <w:rPr>
+                <w:rFonts w:ascii="Calibri" w:cs="Calibri" w:eastAsia="Calibri" w:hAnsi="Calibri"/>
+                <w:b/>
+                <w:bCs/>
+                <w:sz w:val="20"/>
+                <w:szCs w:val="20"/>
+              </w:rPr>
+              <w:t xml:space="preserve">Aylık maliyet (KOBİ)</w:t>
+            </w:r>
+          </w:p>
+        </w:tc>
+        <w:tc>
+          <w:tcPr>
+            <w:tcMar>
+              <w:top w:type="dxa" w:w="80"/>
+              <w:left w:type="dxa" w:w="120"/>
+              <w:bottom w:type="dxa" w:w="80"/>
+              <w:right w:type="dxa" w:w="120"/>
+            </w:tcMar>
+          </w:tcPr>
+          <w:p>
+            <w:pPr>
+              <w:jc w:val="right"/>
+            </w:pPr>
+            <w:r>
+              <w:rPr>
+                <w:rFonts w:ascii="Calibri" w:cs="Calibri" w:eastAsia="Calibri" w:hAnsi="Calibri"/>
+                <w:sz w:val="20"/>
+                <w:szCs w:val="20"/>
+              </w:rPr>
+              <w:t xml:space="preserve">Düşük-orta</w:t>
+            </w:r>
+          </w:p>
+        </w:tc>
+        <w:tc>
+          <w:tcPr>
+            <w:tcMar>
+              <w:top w:type="dxa" w:w="80"/>
+              <w:left w:type="dxa" w:w="120"/>
+              <w:bottom w:type="dxa" w:w="80"/>
+              <w:right w:type="dxa" w:w="120"/>
+            </w:tcMar>
+          </w:tcPr>
+          <w:p>
+            <w:pPr>
+              <w:jc w:val="right"/>
+            </w:pPr>
+            <w:r>
+              <w:rPr>
+                <w:rFonts w:ascii="Calibri" w:cs="Calibri" w:eastAsia="Calibri" w:hAnsi="Calibri"/>
+                <w:sz w:val="20"/>
+                <w:szCs w:val="20"/>
+              </w:rPr>
+              <w:t xml:space="preserve">Çok yüksek</w:t>
+            </w:r>
+          </w:p>
+        </w:tc>
+        <w:tc>
+          <w:tcPr>
+            <w:tcMar>
+              <w:top w:type="dxa" w:w="80"/>
+              <w:left w:type="dxa" w:w="120"/>
+              <w:bottom w:type="dxa" w:w="80"/>
+              <w:right w:type="dxa" w:w="120"/>
+            </w:tcMar>
+          </w:tcPr>
+          <w:p>
+            <w:pPr>
+              <w:jc w:val="right"/>
+            </w:pPr>
+            <w:r>
+              <w:rPr>
+                <w:rFonts w:ascii="Calibri" w:cs="Calibri" w:eastAsia="Calibri" w:hAnsi="Calibri"/>
+                <w:sz w:val="20"/>
+                <w:szCs w:val="20"/>
+              </w:rPr>
+              <w:t xml:space="preserve">Orta</w:t>
+            </w:r>
+          </w:p>
+        </w:tc>
+        <w:tc>
+          <w:tcPr>
+            <w:tcMar>
+              <w:top w:type="dxa" w:w="80"/>
+              <w:left w:type="dxa" w:w="120"/>
+              <w:bottom w:type="dxa" w:w="80"/>
+              <w:right w:type="dxa" w:w="120"/>
+            </w:tcMar>
+          </w:tcPr>
+          <w:p>
+            <w:pPr>
+              <w:jc w:val="right"/>
+            </w:pPr>
+            <w:r>
+              <w:rPr>
+                <w:rFonts w:ascii="Calibri" w:cs="Calibri" w:eastAsia="Calibri" w:hAnsi="Calibri"/>
+                <w:sz w:val="20"/>
+                <w:szCs w:val="20"/>
+              </w:rPr>
+              <w:t xml:space="preserve">Düşük</w:t>
+            </w:r>
+          </w:p>
+        </w:tc>
+        <w:tc>
+          <w:tcPr>
+            <w:tcMar>
+              <w:top w:type="dxa" w:w="80"/>
+              <w:left w:type="dxa" w:w="120"/>
+              <w:bottom w:type="dxa" w:w="80"/>
+              <w:right w:type="dxa" w:w="120"/>
+            </w:tcMar>
+          </w:tcPr>
+          <w:p>
+            <w:pPr>
+              <w:jc w:val="right"/>
+            </w:pPr>
+            <w:r>
+              <w:rPr>
+                <w:rFonts w:ascii="Calibri" w:cs="Calibri" w:eastAsia="Calibri" w:hAnsi="Calibri"/>
+                <w:sz w:val="20"/>
+                <w:szCs w:val="20"/>
+              </w:rPr>
+              <w:t xml:space="preserve">Düşük</w:t>
+            </w:r>
+          </w:p>
+        </w:tc>
+        <w:tc>
+          <w:tcPr>
+            <w:tcMar>
+              <w:top w:type="dxa" w:w="80"/>
+              <w:left w:type="dxa" w:w="120"/>
+              <w:bottom w:type="dxa" w:w="80"/>
+              <w:right w:type="dxa" w:w="120"/>
+            </w:tcMar>
+          </w:tcPr>
+          <w:p>
+            <w:pPr>
+              <w:jc w:val="right"/>
+            </w:pPr>
+            <w:r>
+              <w:rPr>
+                <w:rFonts w:ascii="Calibri" w:cs="Calibri" w:eastAsia="Calibri" w:hAnsi="Calibri"/>
+                <w:sz w:val="20"/>
+                <w:szCs w:val="20"/>
+              </w:rPr>
+              <w:t xml:space="preserve">Orta (paket + entegre)</w:t>
+            </w:r>
+          </w:p>
+        </w:tc>
+      </w:tr>
+    </w:tbl>
+    <w:p>
+      <w:pPr>
+        <w:pStyle w:val="Heading3"/>
+        <w:spacing w:after="100" w:before="200"/>
+      </w:pPr>
+      <w:r>
+        <w:rPr>
+          <w:rFonts w:ascii="Calibri" w:cs="Calibri" w:eastAsia="Calibri" w:hAnsi="Calibri"/>
+          <w:b/>
+          <w:bCs/>
+          <w:color w:val="0F172A"/>
+          <w:sz w:val="24"/>
+          <w:szCs w:val="24"/>
+        </w:rPr>
+        <w:t xml:space="preserve">Kategori Bazlı Boşluk Analizi</w:t>
+      </w:r>
+    </w:p>
+    <w:p>
+      <w:pPr>
+        <w:pStyle w:val="Heading3"/>
+        <w:spacing w:after="100" w:before="200"/>
+      </w:pPr>
+      <w:r>
+        <w:rPr>
+          <w:rFonts w:ascii="Calibri" w:cs="Calibri" w:eastAsia="Calibri" w:hAnsi="Calibri"/>
+          <w:b/>
+          <w:bCs/>
+          <w:color w:val="0F172A"/>
+          <w:sz w:val="24"/>
+          <w:szCs w:val="24"/>
+        </w:rPr>
+        <w:t xml:space="preserve">a) Ön Muhasebe Çözümleri</w:t>
+      </w:r>
+    </w:p>
+    <w:p>
+      <w:pPr>
+        <w:spacing w:after="120" w:line="300"/>
+        <w:jc w:val="left"/>
+      </w:pPr>
+      <w:r>
+        <w:rPr>
+          <w:rFonts w:ascii="Calibri" w:cs="Calibri" w:eastAsia="Calibri" w:hAnsi="Calibri"/>
+          <w:sz w:val="22"/>
+          <w:szCs w:val="22"/>
+        </w:rPr>
+        <w:t xml:space="preserve">Bulut ön muhasebe SaaS pazarı KOBİ tarafında olgunlaştı; muhasebe + faturalama + temel cari yönetimi güçlü. Ancak gerçek karlılık (kanal komisyonu, kargo, iade, sermaye bağlama) pazaryeri operasyonu ve POS, kategorinin doğal kapsamı dışında kalıyor. Bu çözümlere bağlı KOBİ, satış hacmini görür ama net kârını göremez.</w:t>
       </w:r>
     </w:p>
     <w:p>
@@ -9166,7 +12242,7 @@
           <w:sz w:val="22"/>
           <w:szCs w:val="22"/>
         </w:rPr>
-        <w:t xml:space="preserve">Türkçe-ilk tasarım — KOBİ sahibinin diliyle</w:t>
+        <w:t xml:space="preserve">Güçlü: muhasebe + faturalama + e-arşiv</w:t>
       </w:r>
     </w:p>
     <w:p>
@@ -9184,7 +12260,7 @@
           <w:sz w:val="22"/>
           <w:szCs w:val="22"/>
         </w:rPr>
-        <w:t xml:space="preserve">Tek panelde 5+ ürünün işini birleştiren entegrasyon avantajı</w:t>
+        <w:t xml:space="preserve">Zayıf: stok derinliği, çoklu kanal, gerçek karlılık, üretim</w:t>
       </w:r>
     </w:p>
     <w:p>
@@ -9202,7 +12278,38 @@
           <w:sz w:val="22"/>
           <w:szCs w:val="22"/>
         </w:rPr>
-        <w:t xml:space="preserve">Gerçek karlılık motoru — pazardaki rakiplerde yok</w:t>
+        <w:t xml:space="preserve">Ticarium365 fark: aynı veri modeli üzerinde stok+satış+karlılık tek panelde</w:t>
+      </w:r>
+    </w:p>
+    <w:p>
+      <w:pPr>
+        <w:pStyle w:val="Heading3"/>
+        <w:spacing w:after="100" w:before="200"/>
+      </w:pPr>
+      <w:r>
+        <w:rPr>
+          <w:rFonts w:ascii="Calibri" w:cs="Calibri" w:eastAsia="Calibri" w:hAnsi="Calibri"/>
+          <w:b/>
+          <w:bCs/>
+          <w:color w:val="0F172A"/>
+          <w:sz w:val="24"/>
+          <w:szCs w:val="24"/>
+        </w:rPr>
+        <w:t xml:space="preserve">b) Geleneksel ERP Sistemleri</w:t>
+      </w:r>
+    </w:p>
+    <w:p>
+      <w:pPr>
+        <w:spacing w:after="120" w:line="300"/>
+        <w:jc w:val="left"/>
+      </w:pPr>
+      <w:r>
+        <w:rPr>
+          <w:rFonts w:ascii="Calibri" w:cs="Calibri" w:eastAsia="Calibri" w:hAnsi="Calibri"/>
+          <w:sz w:val="22"/>
+          <w:szCs w:val="22"/>
+        </w:rPr>
+        <w:t xml:space="preserve">Modüler güç ve derinlik açısından lider, ancak kurulum süresi, danışmanlık maliyeti ve toplam sahip olma maliyeti KOBİ erişiminin çok üstünde. Eski mimariler genellikle tek-tenant ve modern bulut/multi-tenant ölçek ekonomilerini sunmuyor. KOBİ büyüdüğünde tek seçenek olarak görülüyor; arada köprü ürün eksik.</w:t>
       </w:r>
     </w:p>
     <w:p>
@@ -9220,7 +12327,7 @@
           <w:sz w:val="22"/>
           <w:szCs w:val="22"/>
         </w:rPr>
-        <w:t xml:space="preserve">Multi-tenant + ölçeklenebilir mimari günden 1 hazır</w:t>
+        <w:t xml:space="preserve">Güçlü: modül derinliği, üretim, kurumsal raporlama</w:t>
       </w:r>
     </w:p>
     <w:p>
@@ -9238,24 +12345,7 @@
           <w:sz w:val="22"/>
           <w:szCs w:val="22"/>
         </w:rPr>
-        <w:t xml:space="preserve">Modern teknoloji stack'i — geliştirme hızı yüksek</w:t>
-      </w:r>
-    </w:p>
-    <w:p>
-      <w:pPr>
-        <w:pStyle w:val="Heading3"/>
-        <w:spacing w:after="100" w:before="200"/>
-      </w:pPr>
-      <w:r>
-        <w:rPr>
-          <w:rFonts w:ascii="Calibri" w:cs="Calibri" w:eastAsia="Calibri" w:hAnsi="Calibri"/>
-          <w:b/>
-          <w:bCs/>
-          <w:color w:val="0F172A"/>
-          <w:sz w:val="24"/>
-          <w:szCs w:val="24"/>
-        </w:rPr>
-        <w:t xml:space="preserve">Zayıf Yönler (Weaknesses)</w:t>
+        <w:t xml:space="preserve">Zayıf: kurulum süresi, lisans + danışmanlık maliyeti, modern UX</w:t>
       </w:r>
     </w:p>
     <w:p>
@@ -9273,7 +12363,38 @@
           <w:sz w:val="22"/>
           <w:szCs w:val="22"/>
         </w:rPr>
-        <w:t xml:space="preserve">Henüz canlı müşteri yok — kullanım verisi sıfır</w:t>
+        <w:t xml:space="preserve">Ticarium365 fark: kurumsal modülleri (üretim, BOM, mali müşavir, API) modern multi-tenant SaaS modelinde sunuyor</w:t>
+      </w:r>
+    </w:p>
+    <w:p>
+      <w:pPr>
+        <w:pStyle w:val="Heading3"/>
+        <w:spacing w:after="100" w:before="200"/>
+      </w:pPr>
+      <w:r>
+        <w:rPr>
+          <w:rFonts w:ascii="Calibri" w:cs="Calibri" w:eastAsia="Calibri" w:hAnsi="Calibri"/>
+          <w:b/>
+          <w:bCs/>
+          <w:color w:val="0F172A"/>
+          <w:sz w:val="24"/>
+          <w:szCs w:val="24"/>
+        </w:rPr>
+        <w:t xml:space="preserve">c) Pazaryeri Yönetim Araçları</w:t>
+      </w:r>
+    </w:p>
+    <w:p>
+      <w:pPr>
+        <w:spacing w:after="120" w:line="300"/>
+        <w:jc w:val="left"/>
+      </w:pPr>
+      <w:r>
+        <w:rPr>
+          <w:rFonts w:ascii="Calibri" w:cs="Calibri" w:eastAsia="Calibri" w:hAnsi="Calibri"/>
+          <w:sz w:val="22"/>
+          <w:szCs w:val="22"/>
+        </w:rPr>
+        <w:t xml:space="preserve">Çoklu pazaryeri sync, fiyat/stok yayını, sipariş toplama konularında uzmanlaşmış. Ancak ön muhasebe, POS, üretim ve mali müşavir entegrasyonu kategorinin kapsamı dışında. Satıcı yine de paralel olarak ön muhasebe ve POS yazılımı kullanmak zorunda.</w:t>
       </w:r>
     </w:p>
     <w:p>
@@ -9291,7 +12412,7 @@
           <w:sz w:val="22"/>
           <w:szCs w:val="22"/>
         </w:rPr>
-        <w:t xml:space="preserve">Marka tanınırlığı yok — pazarlama yatırımı gerekli</w:t>
+        <w:t xml:space="preserve">Güçlü: pazaryeri API entegrasyonu, sipariş yönetimi</w:t>
       </w:r>
     </w:p>
     <w:p>
@@ -9309,7 +12430,7 @@
           <w:sz w:val="22"/>
           <w:szCs w:val="22"/>
         </w:rPr>
-        <w:t xml:space="preserve">E-fatura entegratör seçimi tamamlanmadı</w:t>
+        <w:t xml:space="preserve">Zayıf: ön muhasebe, gerçek karlılık, mağaza/şube POS</w:t>
       </w:r>
     </w:p>
     <w:p>
@@ -9327,7 +12448,38 @@
           <w:sz w:val="22"/>
           <w:szCs w:val="22"/>
         </w:rPr>
-        <w:t xml:space="preserve">Pazaryeri API sözleşmeleri henüz yok</w:t>
+        <w:t xml:space="preserve">Ticarium365 fark: aynı ürün kaydı pazaryeri + POS + e-fatura akışında ortak</w:t>
+      </w:r>
+    </w:p>
+    <w:p>
+      <w:pPr>
+        <w:pStyle w:val="Heading3"/>
+        <w:spacing w:after="100" w:before="200"/>
+      </w:pPr>
+      <w:r>
+        <w:rPr>
+          <w:rFonts w:ascii="Calibri" w:cs="Calibri" w:eastAsia="Calibri" w:hAnsi="Calibri"/>
+          <w:b/>
+          <w:bCs/>
+          <w:color w:val="0F172A"/>
+          <w:sz w:val="24"/>
+          <w:szCs w:val="24"/>
+        </w:rPr>
+        <w:t xml:space="preserve">d) POS Yazılımları</w:t>
+      </w:r>
+    </w:p>
+    <w:p>
+      <w:pPr>
+        <w:spacing w:after="120" w:line="300"/>
+        <w:jc w:val="left"/>
+      </w:pPr>
+      <w:r>
+        <w:rPr>
+          <w:rFonts w:ascii="Calibri" w:cs="Calibri" w:eastAsia="Calibri" w:hAnsi="Calibri"/>
+          <w:sz w:val="22"/>
+          <w:szCs w:val="22"/>
+        </w:rPr>
+        <w:t xml:space="preserve">Mağaza içi hızlı satış, barkod, kasa kapanışında lider; çoğunlukla yerel kurulum veya hibrit. Bulut multi-tenant senkronizasyonu, çoklu şube konsolidasyonu ve pazaryeri entegrasyonu zayıf. Veriyi merkezi bir analitik panele aktarmak ek entegrasyon gerektiriyor.</w:t>
       </w:r>
     </w:p>
     <w:p>
@@ -9345,24 +12497,7 @@
           <w:sz w:val="22"/>
           <w:szCs w:val="22"/>
         </w:rPr>
-        <w:t xml:space="preserve">Tek geliştirici / küçük ekip — bus factor riski</w:t>
-      </w:r>
-    </w:p>
-    <w:p>
-      <w:pPr>
-        <w:pStyle w:val="Heading3"/>
-        <w:spacing w:after="100" w:before="200"/>
-      </w:pPr>
-      <w:r>
-        <w:rPr>
-          <w:rFonts w:ascii="Calibri" w:cs="Calibri" w:eastAsia="Calibri" w:hAnsi="Calibri"/>
-          <w:b/>
-          <w:bCs/>
-          <w:color w:val="0F172A"/>
-          <w:sz w:val="24"/>
-          <w:szCs w:val="24"/>
-        </w:rPr>
-        <w:t xml:space="preserve">Fırsatlar (Opportunities)</w:t>
+        <w:t xml:space="preserve">Güçlü: mağaza içi hız, barkod, donanım uyumu</w:t>
       </w:r>
     </w:p>
     <w:p>
@@ -9380,7 +12515,7 @@
           <w:sz w:val="22"/>
           <w:szCs w:val="22"/>
         </w:rPr>
-        <w:t xml:space="preserve">Türkiye'de 3,4M+ KOBİ — devasa pazar</w:t>
+        <w:t xml:space="preserve">Zayıf: çoklu kanal, bulut entegrasyon, ön muhasebe</w:t>
       </w:r>
     </w:p>
     <w:p>
@@ -9398,7 +12533,38 @@
           <w:sz w:val="22"/>
           <w:szCs w:val="22"/>
         </w:rPr>
-        <w:t xml:space="preserve">Mevcut çözümlerin parçalı yapısı — birleştirici fırsatı</w:t>
+        <w:t xml:space="preserve">Ticarium365 fark: POS bir modül, aynı veri modeli pazaryeri + ön muhasebe ile birleşik</w:t>
+      </w:r>
+    </w:p>
+    <w:p>
+      <w:pPr>
+        <w:pStyle w:val="Heading3"/>
+        <w:spacing w:after="100" w:before="200"/>
+      </w:pPr>
+      <w:r>
+        <w:rPr>
+          <w:rFonts w:ascii="Calibri" w:cs="Calibri" w:eastAsia="Calibri" w:hAnsi="Calibri"/>
+          <w:b/>
+          <w:bCs/>
+          <w:color w:val="0F172A"/>
+          <w:sz w:val="24"/>
+          <w:szCs w:val="24"/>
+        </w:rPr>
+        <w:t xml:space="preserve">e) Tek Fonksiyonlu SaaS Araçları</w:t>
+      </w:r>
+    </w:p>
+    <w:p>
+      <w:pPr>
+        <w:spacing w:after="120" w:line="300"/>
+        <w:jc w:val="left"/>
+      </w:pPr>
+      <w:r>
+        <w:rPr>
+          <w:rFonts w:ascii="Calibri" w:cs="Calibri" w:eastAsia="Calibri" w:hAnsi="Calibri"/>
+          <w:sz w:val="22"/>
+          <w:szCs w:val="22"/>
+        </w:rPr>
+        <w:t xml:space="preserve">Belirli bir ihtiyacı (CRM, kampanya, sadakat, gider takibi, OCR vb.) çok iyi çözen niş ürünler. Ancak veri silosu yaratıyorlar; KOBİ sahibi 4-6 ayrı SaaS'e abone olup aynı kayıtları farklı sistemlere giriyor. Toplam aylık maliyet entegre tek panel maliyetini geçiyor.</w:t>
       </w:r>
     </w:p>
     <w:p>
@@ -9416,7 +12582,7 @@
           <w:sz w:val="22"/>
           <w:szCs w:val="22"/>
         </w:rPr>
-        <w:t xml:space="preserve">Pazaryeri ekosistemi büyüyor — entegrasyon talebi artıyor</w:t>
+        <w:t xml:space="preserve">Güçlü: tek konuda derin, hızlı kurulum</w:t>
       </w:r>
     </w:p>
     <w:p>
@@ -9434,7 +12600,7 @@
           <w:sz w:val="22"/>
           <w:szCs w:val="22"/>
         </w:rPr>
-        <w:t xml:space="preserve">KKTC, Azerbaycan, Türk diasporası uluslararasılaşma fırsatı</w:t>
+        <w:t xml:space="preserve">Zayıf: veri silosu, paralel abonelik maliyeti, manuel mutabakat</w:t>
       </w:r>
     </w:p>
     <w:p>
@@ -9452,7 +12618,77 @@
           <w:sz w:val="22"/>
           <w:szCs w:val="22"/>
         </w:rPr>
-        <w:t xml:space="preserve">Mali müşavir / muhasebeci kanalı — B2B2C dağıtım</w:t>
+        <w:t xml:space="preserve">Ticarium365 fark: aynı kapsamı tek panelde + tek abonelikte sunuyor</w:t>
+      </w:r>
+    </w:p>
+    <w:p>
+      <w:pPr>
+        <w:pStyle w:val="Heading3"/>
+        <w:spacing w:after="100" w:before="200"/>
+      </w:pPr>
+      <w:r>
+        <w:rPr>
+          <w:rFonts w:ascii="Calibri" w:cs="Calibri" w:eastAsia="Calibri" w:hAnsi="Calibri"/>
+          <w:b/>
+          <w:bCs/>
+          <w:color w:val="0F172A"/>
+          <w:sz w:val="24"/>
+          <w:szCs w:val="24"/>
+        </w:rPr>
+        <w:t xml:space="preserve">Stratejik Sonuç</w:t>
+      </w:r>
+    </w:p>
+    <w:p>
+      <w:pPr>
+        <w:spacing w:after="120" w:line="300"/>
+        <w:jc w:val="left"/>
+      </w:pPr>
+      <w:r>
+        <w:rPr>
+          <w:rFonts w:ascii="Calibri" w:cs="Calibri" w:eastAsia="Calibri" w:hAnsi="Calibri"/>
+          <w:sz w:val="22"/>
+          <w:szCs w:val="22"/>
+        </w:rPr>
+        <w:t xml:space="preserve">Beş kategorinin hiçbiri tek başına KOBİ'nin uçtan uca operasyon ihtiyacını karşılamıyor. Pazardaki gerçek rekabet, hangi tek kategoriden gelen oyuncunun komşu kategorilere genişleyeceği üzerinden yaşanıyor. Ticarium365'in stratejik konumu, bu beş kategoriyi tek bir veri modeli üzerinde sunan ve üzerine gerçek karlılık + B2B ağı katmanları ekleyen birleştirici platform olmaktır.</w:t>
+      </w:r>
+    </w:p>
+    <w:p>
+      <w:r>
+        <w:br w:type="page"/>
+      </w:r>
+    </w:p>
+    <w:p>
+      <w:pPr>
+        <w:pStyle w:val="Heading1"/>
+        <w:spacing w:after="180" w:before="360"/>
+      </w:pPr>
+      <w:r>
+        <w:rPr>
+          <w:rFonts w:ascii="Calibri" w:cs="Calibri" w:eastAsia="Calibri" w:hAnsi="Calibri"/>
+          <w:b/>
+          <w:bCs/>
+          <w:color w:val="1E40AF"/>
+          <w:sz w:val="36"/>
+          <w:szCs w:val="36"/>
+        </w:rPr>
+        <w:t xml:space="preserve">12. SWOT Analizi</w:t>
+      </w:r>
+    </w:p>
+    <w:p>
+      <w:pPr>
+        <w:pStyle w:val="Heading3"/>
+        <w:spacing w:after="100" w:before="200"/>
+      </w:pPr>
+      <w:r>
+        <w:rPr>
+          <w:rFonts w:ascii="Calibri" w:cs="Calibri" w:eastAsia="Calibri" w:hAnsi="Calibri"/>
+          <w:b/>
+          <w:bCs/>
+          <w:color w:val="0F172A"/>
+          <w:sz w:val="24"/>
+          <w:szCs w:val="24"/>
+        </w:rPr>
+        <w:t xml:space="preserve">Güçlü Yönler (Strengths)</w:t>
       </w:r>
     </w:p>
     <w:p>
@@ -9470,24 +12706,7 @@
           <w:sz w:val="22"/>
           <w:szCs w:val="22"/>
         </w:rPr>
-        <w:t xml:space="preserve">AI ile gerçek karlılık önerisi farklılaşma alanı</w:t>
-      </w:r>
-    </w:p>
-    <w:p>
-      <w:pPr>
-        <w:pStyle w:val="Heading3"/>
-        <w:spacing w:after="100" w:before="200"/>
-      </w:pPr>
-      <w:r>
-        <w:rPr>
-          <w:rFonts w:ascii="Calibri" w:cs="Calibri" w:eastAsia="Calibri" w:hAnsi="Calibri"/>
-          <w:b/>
-          <w:bCs/>
-          <w:color w:val="0F172A"/>
-          <w:sz w:val="24"/>
-          <w:szCs w:val="24"/>
-        </w:rPr>
-        <w:t xml:space="preserve">Tehditler (Threats)</w:t>
+        <w:t xml:space="preserve">Türkçe-ilk tasarım — KOBİ sahibinin diliyle</w:t>
       </w:r>
     </w:p>
     <w:p>
@@ -9505,7 +12724,7 @@
           <w:sz w:val="22"/>
           <w:szCs w:val="22"/>
         </w:rPr>
-        <w:t xml:space="preserve">Logo, Mikro gibi köklü oyuncuların alt segmente inmesi</w:t>
+        <w:t xml:space="preserve">Tek panelde 5+ ürünün işini birleştiren entegrasyon avantajı</w:t>
       </w:r>
     </w:p>
     <w:p>
@@ -9523,7 +12742,7 @@
           <w:sz w:val="22"/>
           <w:szCs w:val="22"/>
         </w:rPr>
-        <w:t xml:space="preserve">Paraşüt'ün modül genişletmesi</w:t>
+        <w:t xml:space="preserve">Gerçek karlılık motoru — pazardaki rakiplerde yok</w:t>
       </w:r>
     </w:p>
     <w:p>
@@ -9541,7 +12760,7 @@
           <w:sz w:val="22"/>
           <w:szCs w:val="22"/>
         </w:rPr>
-        <w:t xml:space="preserve">Pazaryerlerinin kendi seller paneli geliştirmesi</w:t>
+        <w:t xml:space="preserve">Multi-tenant + ölçeklenebilir mimari günden 1 hazır</w:t>
       </w:r>
     </w:p>
     <w:p>
@@ -9559,7 +12778,24 @@
           <w:sz w:val="22"/>
           <w:szCs w:val="22"/>
         </w:rPr>
-        <w:t xml:space="preserve">Regülasyon değişiklikleri (e-fatura, GİB)</w:t>
+        <w:t xml:space="preserve">Modern teknoloji stack'i — geliştirme hızı yüksek</w:t>
+      </w:r>
+    </w:p>
+    <w:p>
+      <w:pPr>
+        <w:pStyle w:val="Heading3"/>
+        <w:spacing w:after="100" w:before="200"/>
+      </w:pPr>
+      <w:r>
+        <w:rPr>
+          <w:rFonts w:ascii="Calibri" w:cs="Calibri" w:eastAsia="Calibri" w:hAnsi="Calibri"/>
+          <w:b/>
+          <w:bCs/>
+          <w:color w:val="0F172A"/>
+          <w:sz w:val="24"/>
+          <w:szCs w:val="24"/>
+        </w:rPr>
+        <w:t xml:space="preserve">Zayıf Yönler (Weaknesses)</w:t>
       </w:r>
     </w:p>
     <w:p>
@@ -9577,6 +12813,310 @@
           <w:sz w:val="22"/>
           <w:szCs w:val="22"/>
         </w:rPr>
+        <w:t xml:space="preserve">Henüz canlı müşteri yok — kullanım verisi sıfır</w:t>
+      </w:r>
+    </w:p>
+    <w:p>
+      <w:pPr>
+        <w:pStyle w:val="ListParagraph"/>
+        <w:numPr>
+          <w:ilvl w:val="0"/>
+          <w:numId w:val="1"/>
+        </w:numPr>
+        <w:spacing w:after="80"/>
+      </w:pPr>
+      <w:r>
+        <w:rPr>
+          <w:rFonts w:ascii="Calibri" w:cs="Calibri" w:eastAsia="Calibri" w:hAnsi="Calibri"/>
+          <w:sz w:val="22"/>
+          <w:szCs w:val="22"/>
+        </w:rPr>
+        <w:t xml:space="preserve">Marka tanınırlığı yok — pazarlama yatırımı gerekli</w:t>
+      </w:r>
+    </w:p>
+    <w:p>
+      <w:pPr>
+        <w:pStyle w:val="ListParagraph"/>
+        <w:numPr>
+          <w:ilvl w:val="0"/>
+          <w:numId w:val="1"/>
+        </w:numPr>
+        <w:spacing w:after="80"/>
+      </w:pPr>
+      <w:r>
+        <w:rPr>
+          <w:rFonts w:ascii="Calibri" w:cs="Calibri" w:eastAsia="Calibri" w:hAnsi="Calibri"/>
+          <w:sz w:val="22"/>
+          <w:szCs w:val="22"/>
+        </w:rPr>
+        <w:t xml:space="preserve">E-fatura entegratör seçimi tamamlanmadı</w:t>
+      </w:r>
+    </w:p>
+    <w:p>
+      <w:pPr>
+        <w:pStyle w:val="ListParagraph"/>
+        <w:numPr>
+          <w:ilvl w:val="0"/>
+          <w:numId w:val="1"/>
+        </w:numPr>
+        <w:spacing w:after="80"/>
+      </w:pPr>
+      <w:r>
+        <w:rPr>
+          <w:rFonts w:ascii="Calibri" w:cs="Calibri" w:eastAsia="Calibri" w:hAnsi="Calibri"/>
+          <w:sz w:val="22"/>
+          <w:szCs w:val="22"/>
+        </w:rPr>
+        <w:t xml:space="preserve">Pazaryeri API sözleşmeleri henüz yok</w:t>
+      </w:r>
+    </w:p>
+    <w:p>
+      <w:pPr>
+        <w:pStyle w:val="ListParagraph"/>
+        <w:numPr>
+          <w:ilvl w:val="0"/>
+          <w:numId w:val="1"/>
+        </w:numPr>
+        <w:spacing w:after="80"/>
+      </w:pPr>
+      <w:r>
+        <w:rPr>
+          <w:rFonts w:ascii="Calibri" w:cs="Calibri" w:eastAsia="Calibri" w:hAnsi="Calibri"/>
+          <w:sz w:val="22"/>
+          <w:szCs w:val="22"/>
+        </w:rPr>
+        <w:t xml:space="preserve">Tek geliştirici / küçük ekip — bus factor riski</w:t>
+      </w:r>
+    </w:p>
+    <w:p>
+      <w:pPr>
+        <w:pStyle w:val="Heading3"/>
+        <w:spacing w:after="100" w:before="200"/>
+      </w:pPr>
+      <w:r>
+        <w:rPr>
+          <w:rFonts w:ascii="Calibri" w:cs="Calibri" w:eastAsia="Calibri" w:hAnsi="Calibri"/>
+          <w:b/>
+          <w:bCs/>
+          <w:color w:val="0F172A"/>
+          <w:sz w:val="24"/>
+          <w:szCs w:val="24"/>
+        </w:rPr>
+        <w:t xml:space="preserve">Fırsatlar (Opportunities)</w:t>
+      </w:r>
+    </w:p>
+    <w:p>
+      <w:pPr>
+        <w:pStyle w:val="ListParagraph"/>
+        <w:numPr>
+          <w:ilvl w:val="0"/>
+          <w:numId w:val="1"/>
+        </w:numPr>
+        <w:spacing w:after="80"/>
+      </w:pPr>
+      <w:r>
+        <w:rPr>
+          <w:rFonts w:ascii="Calibri" w:cs="Calibri" w:eastAsia="Calibri" w:hAnsi="Calibri"/>
+          <w:sz w:val="22"/>
+          <w:szCs w:val="22"/>
+        </w:rPr>
+        <w:t xml:space="preserve">Türkiye'de 3,4M+ KOBİ — devasa pazar</w:t>
+      </w:r>
+    </w:p>
+    <w:p>
+      <w:pPr>
+        <w:pStyle w:val="ListParagraph"/>
+        <w:numPr>
+          <w:ilvl w:val="0"/>
+          <w:numId w:val="1"/>
+        </w:numPr>
+        <w:spacing w:after="80"/>
+      </w:pPr>
+      <w:r>
+        <w:rPr>
+          <w:rFonts w:ascii="Calibri" w:cs="Calibri" w:eastAsia="Calibri" w:hAnsi="Calibri"/>
+          <w:sz w:val="22"/>
+          <w:szCs w:val="22"/>
+        </w:rPr>
+        <w:t xml:space="preserve">Mevcut çözümlerin parçalı yapısı — birleştirici fırsatı</w:t>
+      </w:r>
+    </w:p>
+    <w:p>
+      <w:pPr>
+        <w:pStyle w:val="ListParagraph"/>
+        <w:numPr>
+          <w:ilvl w:val="0"/>
+          <w:numId w:val="1"/>
+        </w:numPr>
+        <w:spacing w:after="80"/>
+      </w:pPr>
+      <w:r>
+        <w:rPr>
+          <w:rFonts w:ascii="Calibri" w:cs="Calibri" w:eastAsia="Calibri" w:hAnsi="Calibri"/>
+          <w:sz w:val="22"/>
+          <w:szCs w:val="22"/>
+        </w:rPr>
+        <w:t xml:space="preserve">Pazaryeri ekosistemi büyüyor — entegrasyon talebi artıyor</w:t>
+      </w:r>
+    </w:p>
+    <w:p>
+      <w:pPr>
+        <w:pStyle w:val="ListParagraph"/>
+        <w:numPr>
+          <w:ilvl w:val="0"/>
+          <w:numId w:val="1"/>
+        </w:numPr>
+        <w:spacing w:after="80"/>
+      </w:pPr>
+      <w:r>
+        <w:rPr>
+          <w:rFonts w:ascii="Calibri" w:cs="Calibri" w:eastAsia="Calibri" w:hAnsi="Calibri"/>
+          <w:sz w:val="22"/>
+          <w:szCs w:val="22"/>
+        </w:rPr>
+        <w:t xml:space="preserve">KKTC, Azerbaycan, Türk diasporası uluslararasılaşma fırsatı</w:t>
+      </w:r>
+    </w:p>
+    <w:p>
+      <w:pPr>
+        <w:pStyle w:val="ListParagraph"/>
+        <w:numPr>
+          <w:ilvl w:val="0"/>
+          <w:numId w:val="1"/>
+        </w:numPr>
+        <w:spacing w:after="80"/>
+      </w:pPr>
+      <w:r>
+        <w:rPr>
+          <w:rFonts w:ascii="Calibri" w:cs="Calibri" w:eastAsia="Calibri" w:hAnsi="Calibri"/>
+          <w:sz w:val="22"/>
+          <w:szCs w:val="22"/>
+        </w:rPr>
+        <w:t xml:space="preserve">Mali müşavir / muhasebeci kanalı — B2B2C dağıtım</w:t>
+      </w:r>
+    </w:p>
+    <w:p>
+      <w:pPr>
+        <w:pStyle w:val="ListParagraph"/>
+        <w:numPr>
+          <w:ilvl w:val="0"/>
+          <w:numId w:val="1"/>
+        </w:numPr>
+        <w:spacing w:after="80"/>
+      </w:pPr>
+      <w:r>
+        <w:rPr>
+          <w:rFonts w:ascii="Calibri" w:cs="Calibri" w:eastAsia="Calibri" w:hAnsi="Calibri"/>
+          <w:sz w:val="22"/>
+          <w:szCs w:val="22"/>
+        </w:rPr>
+        <w:t xml:space="preserve">AI ile gerçek karlılık önerisi farklılaşma alanı</w:t>
+      </w:r>
+    </w:p>
+    <w:p>
+      <w:pPr>
+        <w:pStyle w:val="Heading3"/>
+        <w:spacing w:after="100" w:before="200"/>
+      </w:pPr>
+      <w:r>
+        <w:rPr>
+          <w:rFonts w:ascii="Calibri" w:cs="Calibri" w:eastAsia="Calibri" w:hAnsi="Calibri"/>
+          <w:b/>
+          <w:bCs/>
+          <w:color w:val="0F172A"/>
+          <w:sz w:val="24"/>
+          <w:szCs w:val="24"/>
+        </w:rPr>
+        <w:t xml:space="preserve">Tehditler (Threats)</w:t>
+      </w:r>
+    </w:p>
+    <w:p>
+      <w:pPr>
+        <w:pStyle w:val="ListParagraph"/>
+        <w:numPr>
+          <w:ilvl w:val="0"/>
+          <w:numId w:val="1"/>
+        </w:numPr>
+        <w:spacing w:after="80"/>
+      </w:pPr>
+      <w:r>
+        <w:rPr>
+          <w:rFonts w:ascii="Calibri" w:cs="Calibri" w:eastAsia="Calibri" w:hAnsi="Calibri"/>
+          <w:sz w:val="22"/>
+          <w:szCs w:val="22"/>
+        </w:rPr>
+        <w:t xml:space="preserve">Geleneksel ERP oyuncularının alt segmente (KOBİ) inmesi</w:t>
+      </w:r>
+    </w:p>
+    <w:p>
+      <w:pPr>
+        <w:pStyle w:val="ListParagraph"/>
+        <w:numPr>
+          <w:ilvl w:val="0"/>
+          <w:numId w:val="1"/>
+        </w:numPr>
+        <w:spacing w:after="80"/>
+      </w:pPr>
+      <w:r>
+        <w:rPr>
+          <w:rFonts w:ascii="Calibri" w:cs="Calibri" w:eastAsia="Calibri" w:hAnsi="Calibri"/>
+          <w:sz w:val="22"/>
+          <w:szCs w:val="22"/>
+        </w:rPr>
+        <w:t xml:space="preserve">Mevcut ön muhasebe SaaS oyuncularının modül genişletmesi</w:t>
+      </w:r>
+    </w:p>
+    <w:p>
+      <w:pPr>
+        <w:pStyle w:val="ListParagraph"/>
+        <w:numPr>
+          <w:ilvl w:val="0"/>
+          <w:numId w:val="1"/>
+        </w:numPr>
+        <w:spacing w:after="80"/>
+      </w:pPr>
+      <w:r>
+        <w:rPr>
+          <w:rFonts w:ascii="Calibri" w:cs="Calibri" w:eastAsia="Calibri" w:hAnsi="Calibri"/>
+          <w:sz w:val="22"/>
+          <w:szCs w:val="22"/>
+        </w:rPr>
+        <w:t xml:space="preserve">Pazaryerlerinin kendi yönetim paneli kapsamını genişletmesi</w:t>
+      </w:r>
+    </w:p>
+    <w:p>
+      <w:pPr>
+        <w:pStyle w:val="ListParagraph"/>
+        <w:numPr>
+          <w:ilvl w:val="0"/>
+          <w:numId w:val="1"/>
+        </w:numPr>
+        <w:spacing w:after="80"/>
+      </w:pPr>
+      <w:r>
+        <w:rPr>
+          <w:rFonts w:ascii="Calibri" w:cs="Calibri" w:eastAsia="Calibri" w:hAnsi="Calibri"/>
+          <w:sz w:val="22"/>
+          <w:szCs w:val="22"/>
+        </w:rPr>
+        <w:t xml:space="preserve">Regülasyon değişiklikleri (e-fatura, GİB)</w:t>
+      </w:r>
+    </w:p>
+    <w:p>
+      <w:pPr>
+        <w:pStyle w:val="ListParagraph"/>
+        <w:numPr>
+          <w:ilvl w:val="0"/>
+          <w:numId w:val="1"/>
+        </w:numPr>
+        <w:spacing w:after="80"/>
+      </w:pPr>
+      <w:r>
+        <w:rPr>
+          <w:rFonts w:ascii="Calibri" w:cs="Calibri" w:eastAsia="Calibri" w:hAnsi="Calibri"/>
+          <w:sz w:val="22"/>
+          <w:szCs w:val="22"/>
+        </w:rPr>
         <w:t xml:space="preserve">Ekonomik daralma → KOBİ harcama kısıtı</w:t>
       </w:r>
     </w:p>
@@ -9599,7 +13139,7 @@
           <w:sz w:val="36"/>
           <w:szCs w:val="36"/>
         </w:rPr>
-        <w:t xml:space="preserve">12. Yatırımcı Bakışı</w:t>
+        <w:t xml:space="preserve">13. Yatırımcı Bakışı</w:t>
       </w:r>
     </w:p>
     <w:p>
@@ -10004,7 +13544,7 @@
           <w:sz w:val="36"/>
           <w:szCs w:val="36"/>
         </w:rPr>
-        <w:t xml:space="preserve">13. Uzun Dönem Projeksiyon (1 / 3 / 5 Yıl)</w:t>
+        <w:t xml:space="preserve">14. Uzun Dönem Projeksiyon (1 / 3 / 5 Yıl)</w:t>
       </w:r>
     </w:p>
     <w:p>
@@ -12531,7 +16071,7 @@
           <w:sz w:val="36"/>
           <w:szCs w:val="36"/>
         </w:rPr>
-        <w:t xml:space="preserve">14. Görsel &amp; Grafik Önerileri</w:t>
+        <w:t xml:space="preserve">15. Görsel &amp; Grafik Önerileri</w:t>
       </w:r>
     </w:p>
     <w:p>
@@ -12621,7 +16161,7 @@
           <w:sz w:val="22"/>
           <w:szCs w:val="22"/>
         </w:rPr>
-        <w:t xml:space="preserve">Rakip karşılaştırma matrisi — Paraşüt, Logo, Mikro, Bizim Hesap</w:t>
+        <w:t xml:space="preserve">Kategori bazlı rekabet matrisi — ön muhasebe, ERP, pazaryeri aracı, POS, niş SaaS</w:t>
       </w:r>
     </w:p>
     <w:p>

</xml_diff>